<commit_message>
Update results docx with stacked topX and faceted CDR3 bar figures
Co-Authored-By: Claude Opus 4.6 <noreply@anthropic.com>
Claude-Session: https://claude.ai/code/session_01D55fsgxxDUfDTuPfRhF34U
</commit_message>
<xml_diff>
--- a/immunedb_STATS_API/clonal/Clonal_Analysis_Results.docx
+++ b/immunedb_STATS_API/clonal/Clonal_Analysis_Results.docx
@@ -2254,7 +2254,7 @@
       <w:r>
         <w:drawing>
           <wp:inline xmlns:a="http://schemas.openxmlformats.org/drawingml/2006/main" xmlns:pic="http://schemas.openxmlformats.org/drawingml/2006/picture">
-            <wp:extent cx="5943600" cy="2641600"/>
+            <wp:extent cx="5943600" cy="2161309"/>
             <wp:docPr id="10" name="Picture 10"/>
             <wp:cNvGraphicFramePr>
               <a:graphicFrameLocks noChangeAspect="1"/>
@@ -2263,7 +2263,7 @@
               <a:graphicData uri="http://schemas.openxmlformats.org/drawingml/2006/picture">
                 <pic:pic>
                   <pic:nvPicPr>
-                    <pic:cNvPr id="0" name="10_topX_proportion_by_disease.png"/>
+                    <pic:cNvPr id="0" name="10_topX_stacked_by_disease.png"/>
                     <pic:cNvPicPr/>
                   </pic:nvPicPr>
                   <pic:blipFill>
@@ -2275,7 +2275,7 @@
                   <pic:spPr>
                     <a:xfrm>
                       <a:off x="0" y="0"/>
-                      <a:ext cx="5943600" cy="2641600"/>
+                      <a:ext cx="5943600" cy="2161309"/>
                     </a:xfrm>
                     <a:prstGeom prst="rect"/>
                   </pic:spPr>
@@ -2295,7 +2295,7 @@
           <w:i/>
           <w:sz w:val="20"/>
         </w:rPr>
-        <w:t>Figure 10. Proportion of total copies held by Top 10, Top 100, and Top 1000 clones, by disease category.</w:t>
+        <w:t>Figure 10. Clonal dominance: fraction of total repertoire copies held by Top 10 (red), Top 11-100 (orange), Top 101-1000 (green), and remaining (blue) clones per subject, faceted by disease category and sorted by Top 10 dominance.</w:t>
       </w:r>
     </w:p>
     <w:p/>
@@ -2926,7 +2926,7 @@
       <w:r>
         <w:drawing>
           <wp:inline xmlns:a="http://schemas.openxmlformats.org/drawingml/2006/main" xmlns:pic="http://schemas.openxmlformats.org/drawingml/2006/picture">
-            <wp:extent cx="5943600" cy="4160520"/>
+            <wp:extent cx="5943600" cy="1485900"/>
             <wp:docPr id="11" name="Picture 11"/>
             <wp:cNvGraphicFramePr>
               <a:graphicFrameLocks noChangeAspect="1"/>
@@ -2935,7 +2935,7 @@
               <a:graphicData uri="http://schemas.openxmlformats.org/drawingml/2006/picture">
                 <pic:pic>
                   <pic:nvPicPr>
-                    <pic:cNvPr id="0" name="11_topX_proportion_by_age_disease.png"/>
+                    <pic:cNvPr id="0" name="11_topX_stacked_by_age_disease.png"/>
                     <pic:cNvPicPr/>
                   </pic:nvPicPr>
                   <pic:blipFill>
@@ -2947,7 +2947,7 @@
                   <pic:spPr>
                     <a:xfrm>
                       <a:off x="0" y="0"/>
-                      <a:ext cx="5943600" cy="4160520"/>
+                      <a:ext cx="5943600" cy="1485900"/>
                     </a:xfrm>
                     <a:prstGeom prst="rect"/>
                   </pic:spPr>
@@ -2967,7 +2967,7 @@
           <w:i/>
           <w:sz w:val="20"/>
         </w:rPr>
-        <w:t>Figure 11. Top-X clone proportion by age group, faceted by disease category.</w:t>
+        <w:t>Figure 11. Clonal dominance stacked bars per subject, faceted by disease category and age group, sorted by Top 10 dominance.</w:t>
       </w:r>
     </w:p>
     <w:p/>
@@ -2991,7 +2991,7 @@
       <w:r>
         <w:drawing>
           <wp:inline xmlns:a="http://schemas.openxmlformats.org/drawingml/2006/main" xmlns:pic="http://schemas.openxmlformats.org/drawingml/2006/picture">
-            <wp:extent cx="5943600" cy="4160520"/>
+            <wp:extent cx="5943600" cy="1698171"/>
             <wp:docPr id="12" name="Picture 12"/>
             <wp:cNvGraphicFramePr>
               <a:graphicFrameLocks noChangeAspect="1"/>
@@ -3000,7 +3000,7 @@
               <a:graphicData uri="http://schemas.openxmlformats.org/drawingml/2006/picture">
                 <pic:pic>
                   <pic:nvPicPr>
-                    <pic:cNvPr id="0" name="11b_topX_proportion_by_sex_disease.png"/>
+                    <pic:cNvPr id="0" name="11b_topX_stacked_by_sex_disease.png"/>
                     <pic:cNvPicPr/>
                   </pic:nvPicPr>
                   <pic:blipFill>
@@ -3012,7 +3012,7 @@
                   <pic:spPr>
                     <a:xfrm>
                       <a:off x="0" y="0"/>
-                      <a:ext cx="5943600" cy="4160520"/>
+                      <a:ext cx="5943600" cy="1698171"/>
                     </a:xfrm>
                     <a:prstGeom prst="rect"/>
                   </pic:spPr>
@@ -3032,7 +3032,7 @@
           <w:i/>
           <w:sz w:val="20"/>
         </w:rPr>
-        <w:t>Figure 12. Top-X clone proportion by sex, faceted by disease category.</w:t>
+        <w:t>Figure 12. Clonal dominance stacked bars per subject, faceted by disease category and sex, sorted by Top 10 dominance.</w:t>
       </w:r>
     </w:p>
     <w:p/>
@@ -4173,7 +4173,7 @@
       <w:r>
         <w:drawing>
           <wp:inline xmlns:a="http://schemas.openxmlformats.org/drawingml/2006/main" xmlns:pic="http://schemas.openxmlformats.org/drawingml/2006/picture">
-            <wp:extent cx="5943600" cy="2641600"/>
+            <wp:extent cx="5943600" cy="3241964"/>
             <wp:docPr id="13" name="Picture 13"/>
             <wp:cNvGraphicFramePr>
               <a:graphicFrameLocks noChangeAspect="1"/>
@@ -4194,7 +4194,7 @@
                   <pic:spPr>
                     <a:xfrm>
                       <a:off x="0" y="0"/>
-                      <a:ext cx="5943600" cy="2641600"/>
+                      <a:ext cx="5943600" cy="3241964"/>
                     </a:xfrm>
                     <a:prstGeom prst="rect"/>
                   </pic:spPr>
@@ -4214,7 +4214,7 @@
           <w:i/>
           <w:sz w:val="20"/>
         </w:rPr>
-        <w:t>Figure 13. Average CDR3 amino acid length of top expanded clones (Top 10, Top 100, Top 1000), by disease category.</w:t>
+        <w:t>Figure 13. Average CDR3 amino acid length per subject for Top 10 (red), Top 100 (orange), and Top 1000 (green) expanded clones, faceted by disease category (columns) and clone tier (rows). Subjects sorted by Top 10 CDR3 length.</w:t>
       </w:r>
     </w:p>
     <w:p/>
@@ -4845,7 +4845,7 @@
       <w:r>
         <w:drawing>
           <wp:inline xmlns:a="http://schemas.openxmlformats.org/drawingml/2006/main" xmlns:pic="http://schemas.openxmlformats.org/drawingml/2006/picture">
-            <wp:extent cx="5943600" cy="4160520"/>
+            <wp:extent cx="5943600" cy="2228850"/>
             <wp:docPr id="14" name="Picture 14"/>
             <wp:cNvGraphicFramePr>
               <a:graphicFrameLocks noChangeAspect="1"/>
@@ -4866,7 +4866,7 @@
                   <pic:spPr>
                     <a:xfrm>
                       <a:off x="0" y="0"/>
-                      <a:ext cx="5943600" cy="4160520"/>
+                      <a:ext cx="5943600" cy="2228850"/>
                     </a:xfrm>
                     <a:prstGeom prst="rect"/>
                   </pic:spPr>
@@ -4886,7 +4886,7 @@
           <w:i/>
           <w:sz w:val="20"/>
         </w:rPr>
-        <w:t>Figure 14. Average CDR3 AA length by age group, faceted by disease category and top-X tier.</w:t>
+        <w:t>Figure 14. Average CDR3 AA length per subject, faceted by disease category, age group (columns), and clone tier (rows).</w:t>
       </w:r>
     </w:p>
     <w:p/>
@@ -4910,7 +4910,7 @@
       <w:r>
         <w:drawing>
           <wp:inline xmlns:a="http://schemas.openxmlformats.org/drawingml/2006/main" xmlns:pic="http://schemas.openxmlformats.org/drawingml/2006/picture">
-            <wp:extent cx="5943600" cy="4160520"/>
+            <wp:extent cx="5943600" cy="2547257"/>
             <wp:docPr id="15" name="Picture 15"/>
             <wp:cNvGraphicFramePr>
               <a:graphicFrameLocks noChangeAspect="1"/>
@@ -4931,7 +4931,7 @@
                   <pic:spPr>
                     <a:xfrm>
                       <a:off x="0" y="0"/>
-                      <a:ext cx="5943600" cy="4160520"/>
+                      <a:ext cx="5943600" cy="2547257"/>
                     </a:xfrm>
                     <a:prstGeom prst="rect"/>
                   </pic:spPr>
@@ -4951,7 +4951,7 @@
           <w:i/>
           <w:sz w:val="20"/>
         </w:rPr>
-        <w:t>Figure 15. Average CDR3 AA length by sex, faceted by disease category and top-X tier.</w:t>
+        <w:t>Figure 15. Average CDR3 AA length per subject, faceted by disease category, sex (columns), and clone tier (rows).</w:t>
       </w:r>
     </w:p>
     <w:p/>

</xml_diff>

<commit_message>
Add metadata/demographics section to results docx (Figures 1-11)
Section 1 now covers cohort metadata: dataset composition, metadata
availability, disease category harmonization, sex/age distributions,
and cross-tabulations (disease x sex, disease x age, heatmap). All
subsequent sections renumbered (clone size = 2, clone count = 3,
topX = 4, CDR3 = 5), figures renumbered 12-26.

Co-Authored-By: Claude Opus 4.6 <noreply@anthropic.com>
Claude-Session: https://claude.ai/code/session_01D55fsgxxDUfDTuPfRhF34U
</commit_message>
<xml_diff>
--- a/immunedb_STATS_API/clonal/Clonal_Analysis_Results.docx
+++ b/immunedb_STATS_API/clonal/Clonal_Analysis_Results.docx
@@ -21,7 +21,675 @@
         <w:pStyle w:val="Heading2"/>
       </w:pPr>
       <w:r>
-        <w:t>1. Clone Size Analysis</w:t>
+        <w:t>1. Cohort Metadata and Demographics</w:t>
+      </w:r>
+    </w:p>
+    <w:p>
+      <w:r>
+        <w:t>The study cohort was assembled from seven independent immune repertoire datasets retrieved via the iReceptor Gateway: CD1 (Covid19_db3, n=51), CD2 (covid_db2, n=19), CD3 (covid19, n=13), CVX1 (vaccine2, n=12), CVX2 (covid_vaccine_new, n=5), HC1 (lp16_Igblast), and GT1 (sykesIgblast2020). After excluding control samples (covid_vaccine_new-Fb, Water) and non-human subjects (lp16_Igblast-D159, D154, Hu-1), and removing healthy subjects from the CD3 study (H3, H4, H8), the final analysis included 103 subjects with peripheral blood data.</w:t>
+      </w:r>
+    </w:p>
+    <w:p>
+      <w:pPr>
+        <w:pStyle w:val="Heading3"/>
+      </w:pPr>
+      <w:r>
+        <w:t>1.1 Metadata Availability per Dataset</w:t>
+      </w:r>
+    </w:p>
+    <w:p>
+      <w:r>
+        <w:t>Figure 1 summarizes the metadata fields available across datasets. All datasets provided disease stage and tissue information. Sex metadata was available for all datasets except CD3 and HC1. Age data was available for CD1, CD2, CVX1, and CVX2.</w:t>
+      </w:r>
+    </w:p>
+    <w:p>
+      <w:pPr>
+        <w:jc w:val="center"/>
+      </w:pPr>
+      <w:r>
+        <w:drawing>
+          <wp:inline xmlns:a="http://schemas.openxmlformats.org/drawingml/2006/main" xmlns:pic="http://schemas.openxmlformats.org/drawingml/2006/picture">
+            <wp:extent cx="5943600" cy="3820886"/>
+            <wp:docPr id="1" name="Picture 1"/>
+            <wp:cNvGraphicFramePr>
+              <a:graphicFrameLocks noChangeAspect="1"/>
+            </wp:cNvGraphicFramePr>
+            <a:graphic>
+              <a:graphicData uri="http://schemas.openxmlformats.org/drawingml/2006/picture">
+                <pic:pic>
+                  <pic:nvPicPr>
+                    <pic:cNvPr id="0" name="00_metadata_per_dataset.png"/>
+                    <pic:cNvPicPr/>
+                  </pic:nvPicPr>
+                  <pic:blipFill>
+                    <a:blip r:embed="rId9"/>
+                    <a:stretch>
+                      <a:fillRect/>
+                    </a:stretch>
+                  </pic:blipFill>
+                  <pic:spPr>
+                    <a:xfrm>
+                      <a:off x="0" y="0"/>
+                      <a:ext cx="5943600" cy="3820886"/>
+                    </a:xfrm>
+                    <a:prstGeom prst="rect"/>
+                  </pic:spPr>
+                </pic:pic>
+              </a:graphicData>
+            </a:graphic>
+          </wp:inline>
+        </w:drawing>
+      </w:r>
+    </w:p>
+    <w:p>
+      <w:pPr>
+        <w:jc w:val="center"/>
+      </w:pPr>
+      <w:r>
+        <w:rPr>
+          <w:i/>
+          <w:sz w:val="20"/>
+        </w:rPr>
+        <w:t>Figure 1. Metadata availability per dataset. Bar heights indicate the number of subjects with each metadata type available.</w:t>
+      </w:r>
+    </w:p>
+    <w:p/>
+    <w:p>
+      <w:pPr>
+        <w:pStyle w:val="Heading3"/>
+      </w:pPr>
+      <w:r>
+        <w:t>1.2 Subjects per Dataset</w:t>
+      </w:r>
+    </w:p>
+    <w:p>
+      <w:r>
+        <w:t>Figure 2 shows the number of subjects contributed by each dataset. CD1 was the largest contributor (51 subjects), followed by CD2 (19) and CD3 (13).</w:t>
+      </w:r>
+    </w:p>
+    <w:p>
+      <w:pPr>
+        <w:jc w:val="center"/>
+      </w:pPr>
+      <w:r>
+        <w:drawing>
+          <wp:inline xmlns:a="http://schemas.openxmlformats.org/drawingml/2006/main" xmlns:pic="http://schemas.openxmlformats.org/drawingml/2006/picture">
+            <wp:extent cx="5943600" cy="3467100"/>
+            <wp:docPr id="2" name="Picture 2"/>
+            <wp:cNvGraphicFramePr>
+              <a:graphicFrameLocks noChangeAspect="1"/>
+            </wp:cNvGraphicFramePr>
+            <a:graphic>
+              <a:graphicData uri="http://schemas.openxmlformats.org/drawingml/2006/picture">
+                <pic:pic>
+                  <pic:nvPicPr>
+                    <pic:cNvPr id="0" name="01_subjects_per_dataset.png"/>
+                    <pic:cNvPicPr/>
+                  </pic:nvPicPr>
+                  <pic:blipFill>
+                    <a:blip r:embed="rId10"/>
+                    <a:stretch>
+                      <a:fillRect/>
+                    </a:stretch>
+                  </pic:blipFill>
+                  <pic:spPr>
+                    <a:xfrm>
+                      <a:off x="0" y="0"/>
+                      <a:ext cx="5943600" cy="3467100"/>
+                    </a:xfrm>
+                    <a:prstGeom prst="rect"/>
+                  </pic:spPr>
+                </pic:pic>
+              </a:graphicData>
+            </a:graphic>
+          </wp:inline>
+        </w:drawing>
+      </w:r>
+    </w:p>
+    <w:p>
+      <w:pPr>
+        <w:jc w:val="center"/>
+      </w:pPr>
+      <w:r>
+        <w:rPr>
+          <w:i/>
+          <w:sz w:val="20"/>
+        </w:rPr>
+        <w:t>Figure 2. Number of subjects per dataset.</w:t>
+      </w:r>
+    </w:p>
+    <w:p/>
+    <w:p>
+      <w:pPr>
+        <w:pStyle w:val="Heading3"/>
+      </w:pPr>
+      <w:r>
+        <w:t>1.3 Disease Category Distribution</w:t>
+      </w:r>
+    </w:p>
+    <w:p>
+      <w:r>
+        <w:t>Disease labels from individual studies were harmonized into six categories: Severe (n=27), Mild (n=41), Moderate (n=9), Recovered (n=12), COVID Naive (n=8), and Healthy (n=6). The Mild category was the most represented, combining subjects labeled as "mild" (CD1) and "non-severe" (CD3). The Severe category included subjects with "severe" (CD1, CD3) and "Early phase hypoxaemia" (CD2) labels. The Moderate category comprised CD2 subjects with "Early phase-Stable" or "Early phase-Improving" labels.</w:t>
+      </w:r>
+    </w:p>
+    <w:p>
+      <w:pPr>
+        <w:jc w:val="center"/>
+      </w:pPr>
+      <w:r>
+        <w:drawing>
+          <wp:inline xmlns:a="http://schemas.openxmlformats.org/drawingml/2006/main" xmlns:pic="http://schemas.openxmlformats.org/drawingml/2006/picture">
+            <wp:extent cx="5943600" cy="3782291"/>
+            <wp:docPr id="3" name="Picture 3"/>
+            <wp:cNvGraphicFramePr>
+              <a:graphicFrameLocks noChangeAspect="1"/>
+            </wp:cNvGraphicFramePr>
+            <a:graphic>
+              <a:graphicData uri="http://schemas.openxmlformats.org/drawingml/2006/picture">
+                <pic:pic>
+                  <pic:nvPicPr>
+                    <pic:cNvPr id="0" name="02a_subjects_per_disease_category.png"/>
+                    <pic:cNvPicPr/>
+                  </pic:nvPicPr>
+                  <pic:blipFill>
+                    <a:blip r:embed="rId11"/>
+                    <a:stretch>
+                      <a:fillRect/>
+                    </a:stretch>
+                  </pic:blipFill>
+                  <pic:spPr>
+                    <a:xfrm>
+                      <a:off x="0" y="0"/>
+                      <a:ext cx="5943600" cy="3782291"/>
+                    </a:xfrm>
+                    <a:prstGeom prst="rect"/>
+                  </pic:spPr>
+                </pic:pic>
+              </a:graphicData>
+            </a:graphic>
+          </wp:inline>
+        </w:drawing>
+      </w:r>
+    </w:p>
+    <w:p>
+      <w:pPr>
+        <w:jc w:val="center"/>
+      </w:pPr>
+      <w:r>
+        <w:rPr>
+          <w:i/>
+          <w:sz w:val="20"/>
+        </w:rPr>
+        <w:t>Figure 3. Number of subjects per harmonized disease category.</w:t>
+      </w:r>
+    </w:p>
+    <w:p/>
+    <w:p>
+      <w:pPr>
+        <w:pStyle w:val="Heading3"/>
+      </w:pPr>
+      <w:r>
+        <w:t>1.4 Sex Distribution</w:t>
+      </w:r>
+    </w:p>
+    <w:p>
+      <w:r>
+        <w:t>Among subjects with available sex metadata (n=86), 52 were male and 34 were female. Fourteen subjects (CD3 and HC1 studies) lacked sex annotation.</w:t>
+      </w:r>
+    </w:p>
+    <w:p>
+      <w:pPr>
+        <w:jc w:val="center"/>
+      </w:pPr>
+      <w:r>
+        <w:drawing>
+          <wp:inline xmlns:a="http://schemas.openxmlformats.org/drawingml/2006/main" xmlns:pic="http://schemas.openxmlformats.org/drawingml/2006/picture">
+            <wp:extent cx="5943600" cy="5200650"/>
+            <wp:docPr id="4" name="Picture 4"/>
+            <wp:cNvGraphicFramePr>
+              <a:graphicFrameLocks noChangeAspect="1"/>
+            </wp:cNvGraphicFramePr>
+            <a:graphic>
+              <a:graphicData uri="http://schemas.openxmlformats.org/drawingml/2006/picture">
+                <pic:pic>
+                  <pic:nvPicPr>
+                    <pic:cNvPr id="0" name="02b_subjects_per_sex.png"/>
+                    <pic:cNvPicPr/>
+                  </pic:nvPicPr>
+                  <pic:blipFill>
+                    <a:blip r:embed="rId12"/>
+                    <a:stretch>
+                      <a:fillRect/>
+                    </a:stretch>
+                  </pic:blipFill>
+                  <pic:spPr>
+                    <a:xfrm>
+                      <a:off x="0" y="0"/>
+                      <a:ext cx="5943600" cy="5200650"/>
+                    </a:xfrm>
+                    <a:prstGeom prst="rect"/>
+                  </pic:spPr>
+                </pic:pic>
+              </a:graphicData>
+            </a:graphic>
+          </wp:inline>
+        </w:drawing>
+      </w:r>
+    </w:p>
+    <w:p>
+      <w:pPr>
+        <w:jc w:val="center"/>
+      </w:pPr>
+      <w:r>
+        <w:rPr>
+          <w:i/>
+          <w:sz w:val="20"/>
+        </w:rPr>
+        <w:t>Figure 4. Sex distribution across the cohort.</w:t>
+      </w:r>
+    </w:p>
+    <w:p/>
+    <w:p>
+      <w:pPr>
+        <w:pStyle w:val="Heading3"/>
+      </w:pPr>
+      <w:r>
+        <w:t>1.5 Age Distribution</w:t>
+      </w:r>
+    </w:p>
+    <w:p>
+      <w:r>
+        <w:t>Age data was available for 86 subjects (median 48 years, range 18-87). The age distribution was roughly uniform across the 31-50 and 51-65 groups, with fewer subjects in the youngest (18-30) and oldest (66+) brackets.</w:t>
+      </w:r>
+    </w:p>
+    <w:p>
+      <w:pPr>
+        <w:jc w:val="center"/>
+      </w:pPr>
+      <w:r>
+        <w:drawing>
+          <wp:inline xmlns:a="http://schemas.openxmlformats.org/drawingml/2006/main" xmlns:pic="http://schemas.openxmlformats.org/drawingml/2006/picture">
+            <wp:extent cx="5943600" cy="4160520"/>
+            <wp:docPr id="5" name="Picture 5"/>
+            <wp:cNvGraphicFramePr>
+              <a:graphicFrameLocks noChangeAspect="1"/>
+            </wp:cNvGraphicFramePr>
+            <a:graphic>
+              <a:graphicData uri="http://schemas.openxmlformats.org/drawingml/2006/picture">
+                <pic:pic>
+                  <pic:nvPicPr>
+                    <pic:cNvPr id="0" name="02c_age_distribution.png"/>
+                    <pic:cNvPicPr/>
+                  </pic:nvPicPr>
+                  <pic:blipFill>
+                    <a:blip r:embed="rId13"/>
+                    <a:stretch>
+                      <a:fillRect/>
+                    </a:stretch>
+                  </pic:blipFill>
+                  <pic:spPr>
+                    <a:xfrm>
+                      <a:off x="0" y="0"/>
+                      <a:ext cx="5943600" cy="4160520"/>
+                    </a:xfrm>
+                    <a:prstGeom prst="rect"/>
+                  </pic:spPr>
+                </pic:pic>
+              </a:graphicData>
+            </a:graphic>
+          </wp:inline>
+        </w:drawing>
+      </w:r>
+    </w:p>
+    <w:p>
+      <w:pPr>
+        <w:jc w:val="center"/>
+      </w:pPr>
+      <w:r>
+        <w:rPr>
+          <w:i/>
+          <w:sz w:val="20"/>
+        </w:rPr>
+        <w:t>Figure 5. Age distribution histogram. Red dashed line indicates the median age.</w:t>
+      </w:r>
+    </w:p>
+    <w:p/>
+    <w:p>
+      <w:pPr>
+        <w:jc w:val="center"/>
+      </w:pPr>
+      <w:r>
+        <w:drawing>
+          <wp:inline xmlns:a="http://schemas.openxmlformats.org/drawingml/2006/main" xmlns:pic="http://schemas.openxmlformats.org/drawingml/2006/picture">
+            <wp:extent cx="5943600" cy="5200650"/>
+            <wp:docPr id="6" name="Picture 6"/>
+            <wp:cNvGraphicFramePr>
+              <a:graphicFrameLocks noChangeAspect="1"/>
+            </wp:cNvGraphicFramePr>
+            <a:graphic>
+              <a:graphicData uri="http://schemas.openxmlformats.org/drawingml/2006/picture">
+                <pic:pic>
+                  <pic:nvPicPr>
+                    <pic:cNvPr id="0" name="02d_subjects_per_age_group.png"/>
+                    <pic:cNvPicPr/>
+                  </pic:nvPicPr>
+                  <pic:blipFill>
+                    <a:blip r:embed="rId14"/>
+                    <a:stretch>
+                      <a:fillRect/>
+                    </a:stretch>
+                  </pic:blipFill>
+                  <pic:spPr>
+                    <a:xfrm>
+                      <a:off x="0" y="0"/>
+                      <a:ext cx="5943600" cy="5200650"/>
+                    </a:xfrm>
+                    <a:prstGeom prst="rect"/>
+                  </pic:spPr>
+                </pic:pic>
+              </a:graphicData>
+            </a:graphic>
+          </wp:inline>
+        </w:drawing>
+      </w:r>
+    </w:p>
+    <w:p>
+      <w:pPr>
+        <w:jc w:val="center"/>
+      </w:pPr>
+      <w:r>
+        <w:rPr>
+          <w:i/>
+          <w:sz w:val="20"/>
+        </w:rPr>
+        <w:t>Figure 6. Number of subjects per age group.</w:t>
+      </w:r>
+    </w:p>
+    <w:p/>
+    <w:p>
+      <w:pPr>
+        <w:pStyle w:val="Heading3"/>
+      </w:pPr>
+      <w:r>
+        <w:t>1.6 Cross-tabulations</w:t>
+      </w:r>
+    </w:p>
+    <w:p>
+      <w:r>
+        <w:t>Figures 7-10 show the relationships between disease category, sex, age, and study. The sex ratio was relatively balanced within each disease category. Age distributions varied across disease groups, with Moderate and Recovered subjects tending to be older.</w:t>
+      </w:r>
+    </w:p>
+    <w:p>
+      <w:pPr>
+        <w:jc w:val="center"/>
+      </w:pPr>
+      <w:r>
+        <w:drawing>
+          <wp:inline xmlns:a="http://schemas.openxmlformats.org/drawingml/2006/main" xmlns:pic="http://schemas.openxmlformats.org/drawingml/2006/picture">
+            <wp:extent cx="5943600" cy="3467100"/>
+            <wp:docPr id="7" name="Picture 7"/>
+            <wp:cNvGraphicFramePr>
+              <a:graphicFrameLocks noChangeAspect="1"/>
+            </wp:cNvGraphicFramePr>
+            <a:graphic>
+              <a:graphicData uri="http://schemas.openxmlformats.org/drawingml/2006/picture">
+                <pic:pic>
+                  <pic:nvPicPr>
+                    <pic:cNvPr id="0" name="03a_disease_by_sex.png"/>
+                    <pic:cNvPicPr/>
+                  </pic:nvPicPr>
+                  <pic:blipFill>
+                    <a:blip r:embed="rId15"/>
+                    <a:stretch>
+                      <a:fillRect/>
+                    </a:stretch>
+                  </pic:blipFill>
+                  <pic:spPr>
+                    <a:xfrm>
+                      <a:off x="0" y="0"/>
+                      <a:ext cx="5943600" cy="3467100"/>
+                    </a:xfrm>
+                    <a:prstGeom prst="rect"/>
+                  </pic:spPr>
+                </pic:pic>
+              </a:graphicData>
+            </a:graphic>
+          </wp:inline>
+        </w:drawing>
+      </w:r>
+    </w:p>
+    <w:p>
+      <w:pPr>
+        <w:jc w:val="center"/>
+      </w:pPr>
+      <w:r>
+        <w:rPr>
+          <w:i/>
+          <w:sz w:val="20"/>
+        </w:rPr>
+        <w:t>Figure 7. Disease category by sex.</w:t>
+      </w:r>
+    </w:p>
+    <w:p/>
+    <w:p>
+      <w:pPr>
+        <w:jc w:val="center"/>
+      </w:pPr>
+      <w:r>
+        <w:drawing>
+          <wp:inline xmlns:a="http://schemas.openxmlformats.org/drawingml/2006/main" xmlns:pic="http://schemas.openxmlformats.org/drawingml/2006/picture">
+            <wp:extent cx="5943600" cy="3200400"/>
+            <wp:docPr id="8" name="Picture 8"/>
+            <wp:cNvGraphicFramePr>
+              <a:graphicFrameLocks noChangeAspect="1"/>
+            </wp:cNvGraphicFramePr>
+            <a:graphic>
+              <a:graphicData uri="http://schemas.openxmlformats.org/drawingml/2006/picture">
+                <pic:pic>
+                  <pic:nvPicPr>
+                    <pic:cNvPr id="0" name="03b_disease_by_age_group.png"/>
+                    <pic:cNvPicPr/>
+                  </pic:nvPicPr>
+                  <pic:blipFill>
+                    <a:blip r:embed="rId16"/>
+                    <a:stretch>
+                      <a:fillRect/>
+                    </a:stretch>
+                  </pic:blipFill>
+                  <pic:spPr>
+                    <a:xfrm>
+                      <a:off x="0" y="0"/>
+                      <a:ext cx="5943600" cy="3200400"/>
+                    </a:xfrm>
+                    <a:prstGeom prst="rect"/>
+                  </pic:spPr>
+                </pic:pic>
+              </a:graphicData>
+            </a:graphic>
+          </wp:inline>
+        </w:drawing>
+      </w:r>
+    </w:p>
+    <w:p>
+      <w:pPr>
+        <w:jc w:val="center"/>
+      </w:pPr>
+      <w:r>
+        <w:rPr>
+          <w:i/>
+          <w:sz w:val="20"/>
+        </w:rPr>
+        <w:t>Figure 8. Disease category by age group.</w:t>
+      </w:r>
+    </w:p>
+    <w:p/>
+    <w:p>
+      <w:pPr>
+        <w:jc w:val="center"/>
+      </w:pPr>
+      <w:r>
+        <w:drawing>
+          <wp:inline xmlns:a="http://schemas.openxmlformats.org/drawingml/2006/main" xmlns:pic="http://schemas.openxmlformats.org/drawingml/2006/picture">
+            <wp:extent cx="5943600" cy="3467100"/>
+            <wp:docPr id="9" name="Picture 9"/>
+            <wp:cNvGraphicFramePr>
+              <a:graphicFrameLocks noChangeAspect="1"/>
+            </wp:cNvGraphicFramePr>
+            <a:graphic>
+              <a:graphicData uri="http://schemas.openxmlformats.org/drawingml/2006/picture">
+                <pic:pic>
+                  <pic:nvPicPr>
+                    <pic:cNvPr id="0" name="03c_study_by_disease.png"/>
+                    <pic:cNvPicPr/>
+                  </pic:nvPicPr>
+                  <pic:blipFill>
+                    <a:blip r:embed="rId17"/>
+                    <a:stretch>
+                      <a:fillRect/>
+                    </a:stretch>
+                  </pic:blipFill>
+                  <pic:spPr>
+                    <a:xfrm>
+                      <a:off x="0" y="0"/>
+                      <a:ext cx="5943600" cy="3467100"/>
+                    </a:xfrm>
+                    <a:prstGeom prst="rect"/>
+                  </pic:spPr>
+                </pic:pic>
+              </a:graphicData>
+            </a:graphic>
+          </wp:inline>
+        </w:drawing>
+      </w:r>
+    </w:p>
+    <w:p>
+      <w:pPr>
+        <w:jc w:val="center"/>
+      </w:pPr>
+      <w:r>
+        <w:rPr>
+          <w:i/>
+          <w:sz w:val="20"/>
+        </w:rPr>
+        <w:t>Figure 9. Study composition by disease category.</w:t>
+      </w:r>
+    </w:p>
+    <w:p/>
+    <w:p>
+      <w:pPr>
+        <w:jc w:val="center"/>
+      </w:pPr>
+      <w:r>
+        <w:drawing>
+          <wp:inline xmlns:a="http://schemas.openxmlformats.org/drawingml/2006/main" xmlns:pic="http://schemas.openxmlformats.org/drawingml/2006/picture">
+            <wp:extent cx="5943600" cy="3467100"/>
+            <wp:docPr id="10" name="Picture 10"/>
+            <wp:cNvGraphicFramePr>
+              <a:graphicFrameLocks noChangeAspect="1"/>
+            </wp:cNvGraphicFramePr>
+            <a:graphic>
+              <a:graphicData uri="http://schemas.openxmlformats.org/drawingml/2006/picture">
+                <pic:pic>
+                  <pic:nvPicPr>
+                    <pic:cNvPr id="0" name="03d_age_by_disease_boxplot.png"/>
+                    <pic:cNvPicPr/>
+                  </pic:nvPicPr>
+                  <pic:blipFill>
+                    <a:blip r:embed="rId18"/>
+                    <a:stretch>
+                      <a:fillRect/>
+                    </a:stretch>
+                  </pic:blipFill>
+                  <pic:spPr>
+                    <a:xfrm>
+                      <a:off x="0" y="0"/>
+                      <a:ext cx="5943600" cy="3467100"/>
+                    </a:xfrm>
+                    <a:prstGeom prst="rect"/>
+                  </pic:spPr>
+                </pic:pic>
+              </a:graphicData>
+            </a:graphic>
+          </wp:inline>
+        </w:drawing>
+      </w:r>
+    </w:p>
+    <w:p>
+      <w:pPr>
+        <w:jc w:val="center"/>
+      </w:pPr>
+      <w:r>
+        <w:rPr>
+          <w:i/>
+          <w:sz w:val="20"/>
+        </w:rPr>
+        <w:t>Figure 10. Age distribution by disease category (box plots with individual data points).</w:t>
+      </w:r>
+    </w:p>
+    <w:p/>
+    <w:p>
+      <w:pPr>
+        <w:jc w:val="center"/>
+      </w:pPr>
+      <w:r>
+        <w:drawing>
+          <wp:inline xmlns:a="http://schemas.openxmlformats.org/drawingml/2006/main" xmlns:pic="http://schemas.openxmlformats.org/drawingml/2006/picture">
+            <wp:extent cx="5943600" cy="3657600"/>
+            <wp:docPr id="11" name="Picture 11"/>
+            <wp:cNvGraphicFramePr>
+              <a:graphicFrameLocks noChangeAspect="1"/>
+            </wp:cNvGraphicFramePr>
+            <a:graphic>
+              <a:graphicData uri="http://schemas.openxmlformats.org/drawingml/2006/picture">
+                <pic:pic>
+                  <pic:nvPicPr>
+                    <pic:cNvPr id="0" name="03e_heatmap_disease_age_sex.png"/>
+                    <pic:cNvPicPr/>
+                  </pic:nvPicPr>
+                  <pic:blipFill>
+                    <a:blip r:embed="rId19"/>
+                    <a:stretch>
+                      <a:fillRect/>
+                    </a:stretch>
+                  </pic:blipFill>
+                  <pic:spPr>
+                    <a:xfrm>
+                      <a:off x="0" y="0"/>
+                      <a:ext cx="5943600" cy="3657600"/>
+                    </a:xfrm>
+                    <a:prstGeom prst="rect"/>
+                  </pic:spPr>
+                </pic:pic>
+              </a:graphicData>
+            </a:graphic>
+          </wp:inline>
+        </w:drawing>
+      </w:r>
+    </w:p>
+    <w:p>
+      <w:pPr>
+        <w:jc w:val="center"/>
+      </w:pPr>
+      <w:r>
+        <w:rPr>
+          <w:i/>
+          <w:sz w:val="20"/>
+        </w:rPr>
+        <w:t>Figure 11. Heatmap of subject counts by disease category, age group, and sex.</w:t>
+      </w:r>
+    </w:p>
+    <w:p/>
+    <w:p>
+      <w:r>
+        <w:br w:type="page"/>
+      </w:r>
+    </w:p>
+    <w:p>
+      <w:pPr>
+        <w:pStyle w:val="Heading2"/>
+      </w:pPr>
+      <w:r>
+        <w:t>2. Clone Size Analysis</w:t>
       </w:r>
     </w:p>
     <w:p>
@@ -34,12 +702,12 @@
         <w:pStyle w:val="Heading3"/>
       </w:pPr>
       <w:r>
-        <w:t>1.1 Number of Expanded Clones by Disease Category</w:t>
+        <w:t>2.1 Number of Expanded Clones by Disease Category</w:t>
       </w:r>
     </w:p>
     <w:p>
       <w:r>
-        <w:t>Figure 1 shows the number of expanded clones (size &gt; 20) across disease categories. COVID Naive and Healthy subjects showed higher counts of expanded clones compared to acute disease groups, suggesting pre-existing clonal expansions unrelated to SARS-CoV-2 infection.</w:t>
+        <w:t>Figure 12 shows the number of expanded clones (size &gt; 20) across disease categories. COVID Naive and Healthy subjects showed higher counts of expanded clones compared to acute disease groups, suggesting pre-existing clonal expansions unrelated to SARS-CoV-2 infection.</w:t>
       </w:r>
     </w:p>
     <w:p>
@@ -50,7 +718,7 @@
         <w:drawing>
           <wp:inline xmlns:a="http://schemas.openxmlformats.org/drawingml/2006/main" xmlns:pic="http://schemas.openxmlformats.org/drawingml/2006/picture">
             <wp:extent cx="5943600" cy="3169920"/>
-            <wp:docPr id="1" name="Picture 1"/>
+            <wp:docPr id="12" name="Picture 12"/>
             <wp:cNvGraphicFramePr>
               <a:graphicFrameLocks noChangeAspect="1"/>
             </wp:cNvGraphicFramePr>
@@ -62,7 +730,7 @@
                     <pic:cNvPicPr/>
                   </pic:nvPicPr>
                   <pic:blipFill>
-                    <a:blip r:embed="rId9"/>
+                    <a:blip r:embed="rId20"/>
                     <a:stretch>
                       <a:fillRect/>
                     </a:stretch>
@@ -90,7 +758,7 @@
           <w:i/>
           <w:sz w:val="20"/>
         </w:rPr>
-        <w:t>Figure 1. Number of expanded clones (size &gt; 20) by disease category. Box plots show median and IQR; red diamond indicates mean with SD error bars. Points are colored by original disease label.</w:t>
+        <w:t>Figure 12. Number of expanded clones (size &gt; 20) by disease category. Box plots show median and IQR; red diamond indicates mean with SD error bars. Points are colored by original disease label.</w:t>
       </w:r>
     </w:p>
     <w:p/>
@@ -99,12 +767,12 @@
         <w:pStyle w:val="Heading3"/>
       </w:pPr>
       <w:r>
-        <w:t>1.2 Median Clone Size by Disease Category</w:t>
+        <w:t>2.2 Median Clone Size by Disease Category</w:t>
       </w:r>
     </w:p>
     <w:p>
       <w:r>
-        <w:t>Figure 2 presents the median clone size per subject across disease categories. The median clone size was relatively uniform across groups, with COVID Naive subjects showing slightly elevated values.</w:t>
+        <w:t>Figure 13 presents the median clone size per subject across disease categories. The median clone size was relatively uniform across groups, with COVID Naive subjects showing slightly elevated values.</w:t>
       </w:r>
     </w:p>
     <w:p>
@@ -115,7 +783,7 @@
         <w:drawing>
           <wp:inline xmlns:a="http://schemas.openxmlformats.org/drawingml/2006/main" xmlns:pic="http://schemas.openxmlformats.org/drawingml/2006/picture">
             <wp:extent cx="5943600" cy="3169920"/>
-            <wp:docPr id="2" name="Picture 2"/>
+            <wp:docPr id="13" name="Picture 13"/>
             <wp:cNvGraphicFramePr>
               <a:graphicFrameLocks noChangeAspect="1"/>
             </wp:cNvGraphicFramePr>
@@ -127,7 +795,7 @@
                     <pic:cNvPicPr/>
                   </pic:nvPicPr>
                   <pic:blipFill>
-                    <a:blip r:embed="rId10"/>
+                    <a:blip r:embed="rId21"/>
                     <a:stretch>
                       <a:fillRect/>
                     </a:stretch>
@@ -155,7 +823,7 @@
           <w:i/>
           <w:sz w:val="20"/>
         </w:rPr>
-        <w:t>Figure 2. Median clone size per subject by disease category.</w:t>
+        <w:t>Figure 13. Median clone size per subject by disease category.</w:t>
       </w:r>
     </w:p>
     <w:p/>
@@ -164,12 +832,12 @@
         <w:pStyle w:val="Heading3"/>
       </w:pPr>
       <w:r>
-        <w:t>1.3 Clone Size by Age and Disease</w:t>
+        <w:t>2.3 Clone Size by Age and Disease</w:t>
       </w:r>
     </w:p>
     <w:p>
       <w:r>
-        <w:t>Figures 3 and 4 examine the number of expanded clones and median clone size stratified by age group within each disease category.</w:t>
+        <w:t>Figures 14 and 15 examine the number of expanded clones and median clone size stratified by age group within each disease category.</w:t>
       </w:r>
     </w:p>
     <w:p>
@@ -180,7 +848,7 @@
         <w:drawing>
           <wp:inline xmlns:a="http://schemas.openxmlformats.org/drawingml/2006/main" xmlns:pic="http://schemas.openxmlformats.org/drawingml/2006/picture">
             <wp:extent cx="5943600" cy="4245429"/>
-            <wp:docPr id="3" name="Picture 3"/>
+            <wp:docPr id="14" name="Picture 14"/>
             <wp:cNvGraphicFramePr>
               <a:graphicFrameLocks noChangeAspect="1"/>
             </wp:cNvGraphicFramePr>
@@ -192,7 +860,7 @@
                     <pic:cNvPicPr/>
                   </pic:nvPicPr>
                   <pic:blipFill>
-                    <a:blip r:embed="rId11"/>
+                    <a:blip r:embed="rId22"/>
                     <a:stretch>
                       <a:fillRect/>
                     </a:stretch>
@@ -220,7 +888,7 @@
           <w:i/>
           <w:sz w:val="20"/>
         </w:rPr>
-        <w:t>Figure 3. Number of expanded clones by age group, faceted by disease category.</w:t>
+        <w:t>Figure 14. Number of expanded clones by age group, faceted by disease category.</w:t>
       </w:r>
     </w:p>
     <w:p/>
@@ -232,7 +900,7 @@
         <w:drawing>
           <wp:inline xmlns:a="http://schemas.openxmlformats.org/drawingml/2006/main" xmlns:pic="http://schemas.openxmlformats.org/drawingml/2006/picture">
             <wp:extent cx="5943600" cy="4245429"/>
-            <wp:docPr id="4" name="Picture 4"/>
+            <wp:docPr id="15" name="Picture 15"/>
             <wp:cNvGraphicFramePr>
               <a:graphicFrameLocks noChangeAspect="1"/>
             </wp:cNvGraphicFramePr>
@@ -244,7 +912,7 @@
                     <pic:cNvPicPr/>
                   </pic:nvPicPr>
                   <pic:blipFill>
-                    <a:blip r:embed="rId12"/>
+                    <a:blip r:embed="rId23"/>
                     <a:stretch>
                       <a:fillRect/>
                     </a:stretch>
@@ -272,7 +940,7 @@
           <w:i/>
           <w:sz w:val="20"/>
         </w:rPr>
-        <w:t>Figure 4. Median clone size by age group, faceted by disease category.</w:t>
+        <w:t>Figure 15. Median clone size by age group, faceted by disease category.</w:t>
       </w:r>
     </w:p>
     <w:p/>
@@ -281,12 +949,12 @@
         <w:pStyle w:val="Heading3"/>
       </w:pPr>
       <w:r>
-        <w:t>1.4 Clone Size by Sex and Disease</w:t>
+        <w:t>2.4 Clone Size by Sex and Disease</w:t>
       </w:r>
     </w:p>
     <w:p>
       <w:r>
-        <w:t>Figures 5 and 6 examine sex-based differences in clonal expansion within each disease category.</w:t>
+        <w:t>Figures 16 and 17 examine sex-based differences in clonal expansion within each disease category.</w:t>
       </w:r>
     </w:p>
     <w:p>
@@ -297,7 +965,7 @@
         <w:drawing>
           <wp:inline xmlns:a="http://schemas.openxmlformats.org/drawingml/2006/main" xmlns:pic="http://schemas.openxmlformats.org/drawingml/2006/picture">
             <wp:extent cx="5943600" cy="4245429"/>
-            <wp:docPr id="5" name="Picture 5"/>
+            <wp:docPr id="16" name="Picture 16"/>
             <wp:cNvGraphicFramePr>
               <a:graphicFrameLocks noChangeAspect="1"/>
             </wp:cNvGraphicFramePr>
@@ -309,7 +977,7 @@
                     <pic:cNvPicPr/>
                   </pic:nvPicPr>
                   <pic:blipFill>
-                    <a:blip r:embed="rId13"/>
+                    <a:blip r:embed="rId24"/>
                     <a:stretch>
                       <a:fillRect/>
                     </a:stretch>
@@ -337,7 +1005,7 @@
           <w:i/>
           <w:sz w:val="20"/>
         </w:rPr>
-        <w:t>Figure 5. Number of expanded clones by sex, faceted by disease category.</w:t>
+        <w:t>Figure 16. Number of expanded clones by sex, faceted by disease category.</w:t>
       </w:r>
     </w:p>
     <w:p/>
@@ -349,7 +1017,7 @@
         <w:drawing>
           <wp:inline xmlns:a="http://schemas.openxmlformats.org/drawingml/2006/main" xmlns:pic="http://schemas.openxmlformats.org/drawingml/2006/picture">
             <wp:extent cx="5943600" cy="4245429"/>
-            <wp:docPr id="6" name="Picture 6"/>
+            <wp:docPr id="17" name="Picture 17"/>
             <wp:cNvGraphicFramePr>
               <a:graphicFrameLocks noChangeAspect="1"/>
             </wp:cNvGraphicFramePr>
@@ -361,7 +1029,7 @@
                     <pic:cNvPicPr/>
                   </pic:nvPicPr>
                   <pic:blipFill>
-                    <a:blip r:embed="rId14"/>
+                    <a:blip r:embed="rId25"/>
                     <a:stretch>
                       <a:fillRect/>
                     </a:stretch>
@@ -389,7 +1057,7 @@
           <w:i/>
           <w:sz w:val="20"/>
         </w:rPr>
-        <w:t>Figure 6. Median clone size by sex, faceted by disease category.</w:t>
+        <w:t>Figure 17. Median clone size by sex, faceted by disease category.</w:t>
       </w:r>
     </w:p>
     <w:p/>
@@ -403,7 +1071,7 @@
         <w:pStyle w:val="Heading2"/>
       </w:pPr>
       <w:r>
-        <w:t>2. Clonal Diversity (Clone Count)</w:t>
+        <w:t>3. Clonal Diversity (Clone Count)</w:t>
       </w:r>
     </w:p>
     <w:p>
@@ -416,12 +1084,12 @@
         <w:pStyle w:val="Heading3"/>
       </w:pPr>
       <w:r>
-        <w:t>2.1 Clone Count by Disease Category</w:t>
+        <w:t>3.1 Clone Count by Disease Category</w:t>
       </w:r>
     </w:p>
     <w:p>
       <w:r>
-        <w:t>Figure 7 shows the distribution of unique clone counts across disease categories. Recovered and COVID Naive subjects exhibited markedly higher clone counts (median 21,526 and 16,682, respectively) compared to Mild (2,478) and Severe (5,089) groups, suggesting repertoire expansion following infection or vaccination. The Healthy group showed high variability (range 650-61,136).</w:t>
+        <w:t>Figure 18 shows the distribution of unique clone counts across disease categories. Recovered and COVID Naive subjects exhibited markedly higher clone counts (median 21,526 and 16,682, respectively) compared to Mild (2,478) and Severe (5,089) groups, suggesting repertoire expansion following infection or vaccination. The Healthy group showed high variability (range 650-61,136).</w:t>
       </w:r>
     </w:p>
     <w:p>
@@ -432,7 +1100,7 @@
         <w:drawing>
           <wp:inline xmlns:a="http://schemas.openxmlformats.org/drawingml/2006/main" xmlns:pic="http://schemas.openxmlformats.org/drawingml/2006/picture">
             <wp:extent cx="5943600" cy="3962400"/>
-            <wp:docPr id="7" name="Picture 7"/>
+            <wp:docPr id="18" name="Picture 18"/>
             <wp:cNvGraphicFramePr>
               <a:graphicFrameLocks noChangeAspect="1"/>
             </wp:cNvGraphicFramePr>
@@ -444,7 +1112,7 @@
                     <pic:cNvPicPr/>
                   </pic:nvPicPr>
                   <pic:blipFill>
-                    <a:blip r:embed="rId15"/>
+                    <a:blip r:embed="rId26"/>
                     <a:stretch>
                       <a:fillRect/>
                     </a:stretch>
@@ -472,7 +1140,7 @@
           <w:i/>
           <w:sz w:val="20"/>
         </w:rPr>
-        <w:t>Figure 7. Clone count (number of unique clones) by disease category. Box plots show median and IQR; red diamond indicates mean with SD error bars.</w:t>
+        <w:t>Figure 18. Clone count (number of unique clones) by disease category. Box plots show median and IQR; red diamond indicates mean with SD error bars.</w:t>
       </w:r>
     </w:p>
     <w:p/>
@@ -1202,12 +1870,12 @@
         <w:pStyle w:val="Heading3"/>
       </w:pPr>
       <w:r>
-        <w:t>2.2 Clone Count by Age Group and Disease</w:t>
+        <w:t>3.2 Clone Count by Age Group and Disease</w:t>
       </w:r>
     </w:p>
     <w:p>
       <w:r>
-        <w:t>Figure 8 displays clone count distributions stratified by age group within each disease category.</w:t>
+        <w:t>Figure 19 displays clone count distributions stratified by age group within each disease category.</w:t>
       </w:r>
     </w:p>
     <w:p>
@@ -1218,7 +1886,7 @@
         <w:drawing>
           <wp:inline xmlns:a="http://schemas.openxmlformats.org/drawingml/2006/main" xmlns:pic="http://schemas.openxmlformats.org/drawingml/2006/picture">
             <wp:extent cx="5943600" cy="4245429"/>
-            <wp:docPr id="8" name="Picture 8"/>
+            <wp:docPr id="19" name="Picture 19"/>
             <wp:cNvGraphicFramePr>
               <a:graphicFrameLocks noChangeAspect="1"/>
             </wp:cNvGraphicFramePr>
@@ -1230,7 +1898,7 @@
                     <pic:cNvPicPr/>
                   </pic:nvPicPr>
                   <pic:blipFill>
-                    <a:blip r:embed="rId16"/>
+                    <a:blip r:embed="rId27"/>
                     <a:stretch>
                       <a:fillRect/>
                     </a:stretch>
@@ -1258,7 +1926,7 @@
           <w:i/>
           <w:sz w:val="20"/>
         </w:rPr>
-        <w:t>Figure 8. Clone count by age group, faceted by disease category.</w:t>
+        <w:t>Figure 19. Clone count by age group, faceted by disease category.</w:t>
       </w:r>
     </w:p>
     <w:p/>
@@ -1267,12 +1935,12 @@
         <w:pStyle w:val="Heading3"/>
       </w:pPr>
       <w:r>
-        <w:t>2.3 Clone Count by Sex and Disease</w:t>
+        <w:t>3.3 Clone Count by Sex and Disease</w:t>
       </w:r>
     </w:p>
     <w:p>
       <w:r>
-        <w:t>Figure 9 shows clone count distributions by sex within each disease category. No substantial sex-based differences were observed across disease groups.</w:t>
+        <w:t>Figure 20 shows clone count distributions by sex within each disease category. No substantial sex-based differences were observed across disease groups.</w:t>
       </w:r>
     </w:p>
     <w:p>
@@ -1283,7 +1951,7 @@
         <w:drawing>
           <wp:inline xmlns:a="http://schemas.openxmlformats.org/drawingml/2006/main" xmlns:pic="http://schemas.openxmlformats.org/drawingml/2006/picture">
             <wp:extent cx="5943600" cy="4245429"/>
-            <wp:docPr id="9" name="Picture 9"/>
+            <wp:docPr id="20" name="Picture 20"/>
             <wp:cNvGraphicFramePr>
               <a:graphicFrameLocks noChangeAspect="1"/>
             </wp:cNvGraphicFramePr>
@@ -1295,7 +1963,7 @@
                     <pic:cNvPicPr/>
                   </pic:nvPicPr>
                   <pic:blipFill>
-                    <a:blip r:embed="rId17"/>
+                    <a:blip r:embed="rId28"/>
                     <a:stretch>
                       <a:fillRect/>
                     </a:stretch>
@@ -1323,7 +1991,7 @@
           <w:i/>
           <w:sz w:val="20"/>
         </w:rPr>
-        <w:t>Figure 9. Clone count by sex, faceted by disease category.</w:t>
+        <w:t>Figure 20. Clone count by sex, faceted by disease category.</w:t>
       </w:r>
     </w:p>
     <w:p/>
@@ -2226,7 +2894,7 @@
         <w:pStyle w:val="Heading2"/>
       </w:pPr>
       <w:r>
-        <w:t>3. Top-X Clone Proportion Analysis</w:t>
+        <w:t>4. Top-X Clone Proportion Analysis</w:t>
       </w:r>
     </w:p>
     <w:p>
@@ -2239,12 +2907,12 @@
         <w:pStyle w:val="Heading3"/>
       </w:pPr>
       <w:r>
-        <w:t>3.1 Top-X Proportion by Disease Category</w:t>
+        <w:t>4.1 Top-X Proportion by Disease Category</w:t>
       </w:r>
     </w:p>
     <w:p>
       <w:r>
-        <w:t>Figure 10 shows the proportion of total copies captured by the top 10, 100, and 1000 clones across disease categories. Healthy subjects showed notably high Top 1000 concentration (median 99.3%), indicating that nearly all copies belong to the top 1000 clones, consistent with a repertoire dominated by relatively few expanded clones. Moderate disease subjects showed the highest Top 10 dominance (median 23.1%).</w:t>
+        <w:t>Figure 21 shows the proportion of total copies captured by the top 10, 100, and 1000 clones across disease categories. Healthy subjects showed notably high Top 1000 concentration (median 99.3%), indicating that nearly all copies belong to the top 1000 clones, consistent with a repertoire dominated by relatively few expanded clones. Moderate disease subjects showed the highest Top 10 dominance (median 23.1%).</w:t>
       </w:r>
     </w:p>
     <w:p>
@@ -2255,7 +2923,7 @@
         <w:drawing>
           <wp:inline xmlns:a="http://schemas.openxmlformats.org/drawingml/2006/main" xmlns:pic="http://schemas.openxmlformats.org/drawingml/2006/picture">
             <wp:extent cx="5943600" cy="2161309"/>
-            <wp:docPr id="10" name="Picture 10"/>
+            <wp:docPr id="21" name="Picture 21"/>
             <wp:cNvGraphicFramePr>
               <a:graphicFrameLocks noChangeAspect="1"/>
             </wp:cNvGraphicFramePr>
@@ -2267,7 +2935,7 @@
                     <pic:cNvPicPr/>
                   </pic:nvPicPr>
                   <pic:blipFill>
-                    <a:blip r:embed="rId18"/>
+                    <a:blip r:embed="rId29"/>
                     <a:stretch>
                       <a:fillRect/>
                     </a:stretch>
@@ -2295,7 +2963,7 @@
           <w:i/>
           <w:sz w:val="20"/>
         </w:rPr>
-        <w:t>Figure 10. Clonal dominance: fraction of total repertoire copies held by Top 10 (red), Top 11-100 (orange), Top 101-1000 (green), and remaining (blue) clones per subject, faceted by disease category and sorted by Top 10 dominance.</w:t>
+        <w:t>Figure 21. Clonal dominance: fraction of total repertoire copies held by Top 10 (red), Top 11-100 (orange), Top 101-1000 (green), and remaining (blue) clones per subject, faceted by disease category and sorted by Top 10 dominance.</w:t>
       </w:r>
     </w:p>
     <w:p/>
@@ -2911,12 +3579,12 @@
         <w:pStyle w:val="Heading3"/>
       </w:pPr>
       <w:r>
-        <w:t>3.2 Top-X Proportion by Age and Disease</w:t>
+        <w:t>4.2 Top-X Proportion by Age and Disease</w:t>
       </w:r>
     </w:p>
     <w:p>
       <w:r>
-        <w:t>Figure 11 presents the top-X clone proportions stratified by age group within each disease category.</w:t>
+        <w:t>Figure 22 presents the top-X clone proportions stratified by age group within each disease category.</w:t>
       </w:r>
     </w:p>
     <w:p>
@@ -2927,7 +3595,7 @@
         <w:drawing>
           <wp:inline xmlns:a="http://schemas.openxmlformats.org/drawingml/2006/main" xmlns:pic="http://schemas.openxmlformats.org/drawingml/2006/picture">
             <wp:extent cx="5943600" cy="1485900"/>
-            <wp:docPr id="11" name="Picture 11"/>
+            <wp:docPr id="22" name="Picture 22"/>
             <wp:cNvGraphicFramePr>
               <a:graphicFrameLocks noChangeAspect="1"/>
             </wp:cNvGraphicFramePr>
@@ -2939,7 +3607,7 @@
                     <pic:cNvPicPr/>
                   </pic:nvPicPr>
                   <pic:blipFill>
-                    <a:blip r:embed="rId19"/>
+                    <a:blip r:embed="rId30"/>
                     <a:stretch>
                       <a:fillRect/>
                     </a:stretch>
@@ -2967,7 +3635,7 @@
           <w:i/>
           <w:sz w:val="20"/>
         </w:rPr>
-        <w:t>Figure 11. Clonal dominance stacked bars per subject, faceted by disease category and age group, sorted by Top 10 dominance.</w:t>
+        <w:t>Figure 22. Clonal dominance stacked bars per subject, faceted by disease category and age group, sorted by Top 10 dominance.</w:t>
       </w:r>
     </w:p>
     <w:p/>
@@ -2976,12 +3644,12 @@
         <w:pStyle w:val="Heading3"/>
       </w:pPr>
       <w:r>
-        <w:t>3.3 Top-X Proportion by Sex and Disease</w:t>
+        <w:t>4.3 Top-X Proportion by Sex and Disease</w:t>
       </w:r>
     </w:p>
     <w:p>
       <w:r>
-        <w:t>Figure 12 shows top-X clone proportions by sex within each disease category.</w:t>
+        <w:t>Figure 23 shows top-X clone proportions by sex within each disease category.</w:t>
       </w:r>
     </w:p>
     <w:p>
@@ -2992,7 +3660,7 @@
         <w:drawing>
           <wp:inline xmlns:a="http://schemas.openxmlformats.org/drawingml/2006/main" xmlns:pic="http://schemas.openxmlformats.org/drawingml/2006/picture">
             <wp:extent cx="5943600" cy="1698171"/>
-            <wp:docPr id="12" name="Picture 12"/>
+            <wp:docPr id="23" name="Picture 23"/>
             <wp:cNvGraphicFramePr>
               <a:graphicFrameLocks noChangeAspect="1"/>
             </wp:cNvGraphicFramePr>
@@ -3004,7 +3672,7 @@
                     <pic:cNvPicPr/>
                   </pic:nvPicPr>
                   <pic:blipFill>
-                    <a:blip r:embed="rId20"/>
+                    <a:blip r:embed="rId31"/>
                     <a:stretch>
                       <a:fillRect/>
                     </a:stretch>
@@ -3032,7 +3700,7 @@
           <w:i/>
           <w:sz w:val="20"/>
         </w:rPr>
-        <w:t>Figure 12. Clonal dominance stacked bars per subject, faceted by disease category and sex, sorted by Top 10 dominance.</w:t>
+        <w:t>Figure 23. Clonal dominance stacked bars per subject, faceted by disease category and sex, sorted by Top 10 dominance.</w:t>
       </w:r>
     </w:p>
     <w:p/>
@@ -4145,7 +4813,7 @@
         <w:pStyle w:val="Heading2"/>
       </w:pPr>
       <w:r>
-        <w:t>4. CDR3 Amino Acid Length Analysis</w:t>
+        <w:t>5. CDR3 Amino Acid Length Analysis</w:t>
       </w:r>
     </w:p>
     <w:p>
@@ -4158,12 +4826,12 @@
         <w:pStyle w:val="Heading3"/>
       </w:pPr>
       <w:r>
-        <w:t>4.1 CDR3 Length by Disease Category</w:t>
+        <w:t>5.1 CDR3 Length by Disease Category</w:t>
       </w:r>
     </w:p>
     <w:p>
       <w:r>
-        <w:t>Figure 13 shows the average CDR3 AA length of the top expanded clones across disease categories. Severe cases exhibited the longest CDR3 lengths in Top 10 clones (median 17.7 AA), while Healthy subjects showed the shortest (median 13.8 AA). This difference was most pronounced in the Top 10 tier and diminished progressively with larger clone sets (Top 100, Top 1000), suggesting that the most expanded clones in severe disease tend to use longer CDR3 regions.</w:t>
+        <w:t>Figure 24 shows the average CDR3 AA length of the top expanded clones across disease categories. Severe cases exhibited the longest CDR3 lengths in Top 10 clones (median 17.7 AA), while Healthy subjects showed the shortest (median 13.8 AA). This difference was most pronounced in the Top 10 tier and diminished progressively with larger clone sets (Top 100, Top 1000), suggesting that the most expanded clones in severe disease tend to use longer CDR3 regions.</w:t>
       </w:r>
     </w:p>
     <w:p>
@@ -4174,7 +4842,7 @@
         <w:drawing>
           <wp:inline xmlns:a="http://schemas.openxmlformats.org/drawingml/2006/main" xmlns:pic="http://schemas.openxmlformats.org/drawingml/2006/picture">
             <wp:extent cx="5943600" cy="3241964"/>
-            <wp:docPr id="13" name="Picture 13"/>
+            <wp:docPr id="24" name="Picture 24"/>
             <wp:cNvGraphicFramePr>
               <a:graphicFrameLocks noChangeAspect="1"/>
             </wp:cNvGraphicFramePr>
@@ -4186,7 +4854,7 @@
                     <pic:cNvPicPr/>
                   </pic:nvPicPr>
                   <pic:blipFill>
-                    <a:blip r:embed="rId21"/>
+                    <a:blip r:embed="rId32"/>
                     <a:stretch>
                       <a:fillRect/>
                     </a:stretch>
@@ -4214,7 +4882,7 @@
           <w:i/>
           <w:sz w:val="20"/>
         </w:rPr>
-        <w:t>Figure 13. Average CDR3 amino acid length per subject for Top 10 (red), Top 100 (orange), and Top 1000 (green) expanded clones, faceted by disease category (columns) and clone tier (rows). Subjects sorted by Top 10 CDR3 length.</w:t>
+        <w:t>Figure 24. Average CDR3 amino acid length per subject for Top 10 (red), Top 100 (orange), and Top 1000 (green) expanded clones, faceted by disease category (columns) and clone tier (rows). Subjects sorted by Top 10 CDR3 length.</w:t>
       </w:r>
     </w:p>
     <w:p/>
@@ -4830,12 +5498,12 @@
         <w:pStyle w:val="Heading3"/>
       </w:pPr>
       <w:r>
-        <w:t>4.2 CDR3 Length by Age and Disease</w:t>
+        <w:t>5.2 CDR3 Length by Age and Disease</w:t>
       </w:r>
     </w:p>
     <w:p>
       <w:r>
-        <w:t>Figure 14 shows CDR3 AA length distributions stratified by age group within each disease category.</w:t>
+        <w:t>Figure 25 shows CDR3 AA length distributions stratified by age group within each disease category.</w:t>
       </w:r>
     </w:p>
     <w:p>
@@ -4846,7 +5514,7 @@
         <w:drawing>
           <wp:inline xmlns:a="http://schemas.openxmlformats.org/drawingml/2006/main" xmlns:pic="http://schemas.openxmlformats.org/drawingml/2006/picture">
             <wp:extent cx="5943600" cy="2228850"/>
-            <wp:docPr id="14" name="Picture 14"/>
+            <wp:docPr id="25" name="Picture 25"/>
             <wp:cNvGraphicFramePr>
               <a:graphicFrameLocks noChangeAspect="1"/>
             </wp:cNvGraphicFramePr>
@@ -4858,7 +5526,7 @@
                     <pic:cNvPicPr/>
                   </pic:nvPicPr>
                   <pic:blipFill>
-                    <a:blip r:embed="rId22"/>
+                    <a:blip r:embed="rId33"/>
                     <a:stretch>
                       <a:fillRect/>
                     </a:stretch>
@@ -4886,7 +5554,7 @@
           <w:i/>
           <w:sz w:val="20"/>
         </w:rPr>
-        <w:t>Figure 14. Average CDR3 AA length per subject, faceted by disease category, age group (columns), and clone tier (rows).</w:t>
+        <w:t>Figure 25. Average CDR3 AA length per subject, faceted by disease category, age group (columns), and clone tier (rows).</w:t>
       </w:r>
     </w:p>
     <w:p/>
@@ -4895,12 +5563,12 @@
         <w:pStyle w:val="Heading3"/>
       </w:pPr>
       <w:r>
-        <w:t>4.3 CDR3 Length by Sex and Disease</w:t>
+        <w:t>5.3 CDR3 Length by Sex and Disease</w:t>
       </w:r>
     </w:p>
     <w:p>
       <w:r>
-        <w:t>Figure 15 presents CDR3 AA length distributions by sex within each disease category.</w:t>
+        <w:t>Figure 26 presents CDR3 AA length distributions by sex within each disease category.</w:t>
       </w:r>
     </w:p>
     <w:p>
@@ -4911,7 +5579,7 @@
         <w:drawing>
           <wp:inline xmlns:a="http://schemas.openxmlformats.org/drawingml/2006/main" xmlns:pic="http://schemas.openxmlformats.org/drawingml/2006/picture">
             <wp:extent cx="5943600" cy="2547257"/>
-            <wp:docPr id="15" name="Picture 15"/>
+            <wp:docPr id="26" name="Picture 26"/>
             <wp:cNvGraphicFramePr>
               <a:graphicFrameLocks noChangeAspect="1"/>
             </wp:cNvGraphicFramePr>
@@ -4923,7 +5591,7 @@
                     <pic:cNvPicPr/>
                   </pic:nvPicPr>
                   <pic:blipFill>
-                    <a:blip r:embed="rId23"/>
+                    <a:blip r:embed="rId34"/>
                     <a:stretch>
                       <a:fillRect/>
                     </a:stretch>
@@ -4951,7 +5619,7 @@
           <w:i/>
           <w:sz w:val="20"/>
         </w:rPr>
-        <w:t>Figure 15. Average CDR3 AA length per subject, faceted by disease category, sex (columns), and clone tier (rows).</w:t>
+        <w:t>Figure 26. Average CDR3 AA length per subject, faceted by disease category, sex (columns), and clone tier (rows).</w:t>
       </w:r>
     </w:p>
     <w:p/>

</xml_diff>

<commit_message>
Improve topX figure readability and make docx figures larger
Remove x-axis subject ID labels from topX stacked bar figures for cleaner
appearance. Add landscape page orientation for wide figures (topX and CDR3)
in the docx. Increase default figure width and DPI for clarity.

Co-Authored-By: Claude Opus 4.6 <noreply@anthropic.com>
Claude-Session: https://claude.ai/code/session_01D55fsgxxDUfDTuPfRhF34U
</commit_message>
<xml_diff>
--- a/immunedb_STATS_API/clonal/Clonal_Analysis_Results.docx
+++ b/immunedb_STATS_API/clonal/Clonal_Analysis_Results.docx
@@ -49,7 +49,7 @@
       <w:r>
         <w:drawing>
           <wp:inline xmlns:a="http://schemas.openxmlformats.org/drawingml/2006/main" xmlns:pic="http://schemas.openxmlformats.org/drawingml/2006/picture">
-            <wp:extent cx="5943600" cy="3820886"/>
+            <wp:extent cx="6400800" cy="4114800"/>
             <wp:docPr id="1" name="Picture 1"/>
             <wp:cNvGraphicFramePr>
               <a:graphicFrameLocks noChangeAspect="1"/>
@@ -70,7 +70,7 @@
                   <pic:spPr>
                     <a:xfrm>
                       <a:off x="0" y="0"/>
-                      <a:ext cx="5943600" cy="3820886"/>
+                      <a:ext cx="6400800" cy="4114800"/>
                     </a:xfrm>
                     <a:prstGeom prst="rect"/>
                   </pic:spPr>
@@ -114,7 +114,7 @@
       <w:r>
         <w:drawing>
           <wp:inline xmlns:a="http://schemas.openxmlformats.org/drawingml/2006/main" xmlns:pic="http://schemas.openxmlformats.org/drawingml/2006/picture">
-            <wp:extent cx="5943600" cy="3467100"/>
+            <wp:extent cx="6400800" cy="3733800"/>
             <wp:docPr id="2" name="Picture 2"/>
             <wp:cNvGraphicFramePr>
               <a:graphicFrameLocks noChangeAspect="1"/>
@@ -135,7 +135,7 @@
                   <pic:spPr>
                     <a:xfrm>
                       <a:off x="0" y="0"/>
-                      <a:ext cx="5943600" cy="3467100"/>
+                      <a:ext cx="6400800" cy="3733800"/>
                     </a:xfrm>
                     <a:prstGeom prst="rect"/>
                   </pic:spPr>
@@ -179,7 +179,7 @@
       <w:r>
         <w:drawing>
           <wp:inline xmlns:a="http://schemas.openxmlformats.org/drawingml/2006/main" xmlns:pic="http://schemas.openxmlformats.org/drawingml/2006/picture">
-            <wp:extent cx="5943600" cy="3782291"/>
+            <wp:extent cx="6400800" cy="4073236"/>
             <wp:docPr id="3" name="Picture 3"/>
             <wp:cNvGraphicFramePr>
               <a:graphicFrameLocks noChangeAspect="1"/>
@@ -200,7 +200,7 @@
                   <pic:spPr>
                     <a:xfrm>
                       <a:off x="0" y="0"/>
-                      <a:ext cx="5943600" cy="3782291"/>
+                      <a:ext cx="6400800" cy="4073236"/>
                     </a:xfrm>
                     <a:prstGeom prst="rect"/>
                   </pic:spPr>
@@ -244,7 +244,7 @@
       <w:r>
         <w:drawing>
           <wp:inline xmlns:a="http://schemas.openxmlformats.org/drawingml/2006/main" xmlns:pic="http://schemas.openxmlformats.org/drawingml/2006/picture">
-            <wp:extent cx="5943600" cy="5200650"/>
+            <wp:extent cx="6400800" cy="5600700"/>
             <wp:docPr id="4" name="Picture 4"/>
             <wp:cNvGraphicFramePr>
               <a:graphicFrameLocks noChangeAspect="1"/>
@@ -265,7 +265,7 @@
                   <pic:spPr>
                     <a:xfrm>
                       <a:off x="0" y="0"/>
-                      <a:ext cx="5943600" cy="5200650"/>
+                      <a:ext cx="6400800" cy="5600700"/>
                     </a:xfrm>
                     <a:prstGeom prst="rect"/>
                   </pic:spPr>
@@ -309,7 +309,7 @@
       <w:r>
         <w:drawing>
           <wp:inline xmlns:a="http://schemas.openxmlformats.org/drawingml/2006/main" xmlns:pic="http://schemas.openxmlformats.org/drawingml/2006/picture">
-            <wp:extent cx="5943600" cy="4160520"/>
+            <wp:extent cx="6400800" cy="4480560"/>
             <wp:docPr id="5" name="Picture 5"/>
             <wp:cNvGraphicFramePr>
               <a:graphicFrameLocks noChangeAspect="1"/>
@@ -330,7 +330,7 @@
                   <pic:spPr>
                     <a:xfrm>
                       <a:off x="0" y="0"/>
-                      <a:ext cx="5943600" cy="4160520"/>
+                      <a:ext cx="6400800" cy="4480560"/>
                     </a:xfrm>
                     <a:prstGeom prst="rect"/>
                   </pic:spPr>
@@ -361,7 +361,7 @@
       <w:r>
         <w:drawing>
           <wp:inline xmlns:a="http://schemas.openxmlformats.org/drawingml/2006/main" xmlns:pic="http://schemas.openxmlformats.org/drawingml/2006/picture">
-            <wp:extent cx="5943600" cy="5200650"/>
+            <wp:extent cx="6400800" cy="5600700"/>
             <wp:docPr id="6" name="Picture 6"/>
             <wp:cNvGraphicFramePr>
               <a:graphicFrameLocks noChangeAspect="1"/>
@@ -382,7 +382,7 @@
                   <pic:spPr>
                     <a:xfrm>
                       <a:off x="0" y="0"/>
-                      <a:ext cx="5943600" cy="5200650"/>
+                      <a:ext cx="6400800" cy="5600700"/>
                     </a:xfrm>
                     <a:prstGeom prst="rect"/>
                   </pic:spPr>
@@ -426,7 +426,7 @@
       <w:r>
         <w:drawing>
           <wp:inline xmlns:a="http://schemas.openxmlformats.org/drawingml/2006/main" xmlns:pic="http://schemas.openxmlformats.org/drawingml/2006/picture">
-            <wp:extent cx="5943600" cy="3467100"/>
+            <wp:extent cx="6400800" cy="3733800"/>
             <wp:docPr id="7" name="Picture 7"/>
             <wp:cNvGraphicFramePr>
               <a:graphicFrameLocks noChangeAspect="1"/>
@@ -447,7 +447,7 @@
                   <pic:spPr>
                     <a:xfrm>
                       <a:off x="0" y="0"/>
-                      <a:ext cx="5943600" cy="3467100"/>
+                      <a:ext cx="6400800" cy="3733800"/>
                     </a:xfrm>
                     <a:prstGeom prst="rect"/>
                   </pic:spPr>
@@ -478,7 +478,7 @@
       <w:r>
         <w:drawing>
           <wp:inline xmlns:a="http://schemas.openxmlformats.org/drawingml/2006/main" xmlns:pic="http://schemas.openxmlformats.org/drawingml/2006/picture">
-            <wp:extent cx="5943600" cy="3200400"/>
+            <wp:extent cx="6400800" cy="3446585"/>
             <wp:docPr id="8" name="Picture 8"/>
             <wp:cNvGraphicFramePr>
               <a:graphicFrameLocks noChangeAspect="1"/>
@@ -499,7 +499,7 @@
                   <pic:spPr>
                     <a:xfrm>
                       <a:off x="0" y="0"/>
-                      <a:ext cx="5943600" cy="3200400"/>
+                      <a:ext cx="6400800" cy="3446585"/>
                     </a:xfrm>
                     <a:prstGeom prst="rect"/>
                   </pic:spPr>
@@ -530,7 +530,7 @@
       <w:r>
         <w:drawing>
           <wp:inline xmlns:a="http://schemas.openxmlformats.org/drawingml/2006/main" xmlns:pic="http://schemas.openxmlformats.org/drawingml/2006/picture">
-            <wp:extent cx="5943600" cy="3467100"/>
+            <wp:extent cx="6400800" cy="3733800"/>
             <wp:docPr id="9" name="Picture 9"/>
             <wp:cNvGraphicFramePr>
               <a:graphicFrameLocks noChangeAspect="1"/>
@@ -551,7 +551,7 @@
                   <pic:spPr>
                     <a:xfrm>
                       <a:off x="0" y="0"/>
-                      <a:ext cx="5943600" cy="3467100"/>
+                      <a:ext cx="6400800" cy="3733800"/>
                     </a:xfrm>
                     <a:prstGeom prst="rect"/>
                   </pic:spPr>
@@ -582,7 +582,7 @@
       <w:r>
         <w:drawing>
           <wp:inline xmlns:a="http://schemas.openxmlformats.org/drawingml/2006/main" xmlns:pic="http://schemas.openxmlformats.org/drawingml/2006/picture">
-            <wp:extent cx="5943600" cy="3467100"/>
+            <wp:extent cx="6400800" cy="3733800"/>
             <wp:docPr id="10" name="Picture 10"/>
             <wp:cNvGraphicFramePr>
               <a:graphicFrameLocks noChangeAspect="1"/>
@@ -603,7 +603,7 @@
                   <pic:spPr>
                     <a:xfrm>
                       <a:off x="0" y="0"/>
-                      <a:ext cx="5943600" cy="3467100"/>
+                      <a:ext cx="6400800" cy="3733800"/>
                     </a:xfrm>
                     <a:prstGeom prst="rect"/>
                   </pic:spPr>
@@ -634,7 +634,7 @@
       <w:r>
         <w:drawing>
           <wp:inline xmlns:a="http://schemas.openxmlformats.org/drawingml/2006/main" xmlns:pic="http://schemas.openxmlformats.org/drawingml/2006/picture">
-            <wp:extent cx="5943600" cy="3657600"/>
+            <wp:extent cx="6400800" cy="3938954"/>
             <wp:docPr id="11" name="Picture 11"/>
             <wp:cNvGraphicFramePr>
               <a:graphicFrameLocks noChangeAspect="1"/>
@@ -655,7 +655,7 @@
                   <pic:spPr>
                     <a:xfrm>
                       <a:off x="0" y="0"/>
-                      <a:ext cx="5943600" cy="3657600"/>
+                      <a:ext cx="6400800" cy="3938954"/>
                     </a:xfrm>
                     <a:prstGeom prst="rect"/>
                   </pic:spPr>
@@ -717,7 +717,7 @@
       <w:r>
         <w:drawing>
           <wp:inline xmlns:a="http://schemas.openxmlformats.org/drawingml/2006/main" xmlns:pic="http://schemas.openxmlformats.org/drawingml/2006/picture">
-            <wp:extent cx="5943600" cy="3169920"/>
+            <wp:extent cx="6400800" cy="3413760"/>
             <wp:docPr id="12" name="Picture 12"/>
             <wp:cNvGraphicFramePr>
               <a:graphicFrameLocks noChangeAspect="1"/>
@@ -738,7 +738,7 @@
                   <pic:spPr>
                     <a:xfrm>
                       <a:off x="0" y="0"/>
-                      <a:ext cx="5943600" cy="3169920"/>
+                      <a:ext cx="6400800" cy="3413760"/>
                     </a:xfrm>
                     <a:prstGeom prst="rect"/>
                   </pic:spPr>
@@ -782,7 +782,7 @@
       <w:r>
         <w:drawing>
           <wp:inline xmlns:a="http://schemas.openxmlformats.org/drawingml/2006/main" xmlns:pic="http://schemas.openxmlformats.org/drawingml/2006/picture">
-            <wp:extent cx="5943600" cy="3169920"/>
+            <wp:extent cx="6400800" cy="3413760"/>
             <wp:docPr id="13" name="Picture 13"/>
             <wp:cNvGraphicFramePr>
               <a:graphicFrameLocks noChangeAspect="1"/>
@@ -803,7 +803,7 @@
                   <pic:spPr>
                     <a:xfrm>
                       <a:off x="0" y="0"/>
-                      <a:ext cx="5943600" cy="3169920"/>
+                      <a:ext cx="6400800" cy="3413760"/>
                     </a:xfrm>
                     <a:prstGeom prst="rect"/>
                   </pic:spPr>
@@ -847,7 +847,7 @@
       <w:r>
         <w:drawing>
           <wp:inline xmlns:a="http://schemas.openxmlformats.org/drawingml/2006/main" xmlns:pic="http://schemas.openxmlformats.org/drawingml/2006/picture">
-            <wp:extent cx="5943600" cy="4245429"/>
+            <wp:extent cx="6400800" cy="4572000"/>
             <wp:docPr id="14" name="Picture 14"/>
             <wp:cNvGraphicFramePr>
               <a:graphicFrameLocks noChangeAspect="1"/>
@@ -868,7 +868,7 @@
                   <pic:spPr>
                     <a:xfrm>
                       <a:off x="0" y="0"/>
-                      <a:ext cx="5943600" cy="4245429"/>
+                      <a:ext cx="6400800" cy="4572000"/>
                     </a:xfrm>
                     <a:prstGeom prst="rect"/>
                   </pic:spPr>
@@ -899,7 +899,7 @@
       <w:r>
         <w:drawing>
           <wp:inline xmlns:a="http://schemas.openxmlformats.org/drawingml/2006/main" xmlns:pic="http://schemas.openxmlformats.org/drawingml/2006/picture">
-            <wp:extent cx="5943600" cy="4245429"/>
+            <wp:extent cx="6400800" cy="4572000"/>
             <wp:docPr id="15" name="Picture 15"/>
             <wp:cNvGraphicFramePr>
               <a:graphicFrameLocks noChangeAspect="1"/>
@@ -920,7 +920,7 @@
                   <pic:spPr>
                     <a:xfrm>
                       <a:off x="0" y="0"/>
-                      <a:ext cx="5943600" cy="4245429"/>
+                      <a:ext cx="6400800" cy="4572000"/>
                     </a:xfrm>
                     <a:prstGeom prst="rect"/>
                   </pic:spPr>
@@ -964,7 +964,7 @@
       <w:r>
         <w:drawing>
           <wp:inline xmlns:a="http://schemas.openxmlformats.org/drawingml/2006/main" xmlns:pic="http://schemas.openxmlformats.org/drawingml/2006/picture">
-            <wp:extent cx="5943600" cy="4245429"/>
+            <wp:extent cx="6400800" cy="4572000"/>
             <wp:docPr id="16" name="Picture 16"/>
             <wp:cNvGraphicFramePr>
               <a:graphicFrameLocks noChangeAspect="1"/>
@@ -985,7 +985,7 @@
                   <pic:spPr>
                     <a:xfrm>
                       <a:off x="0" y="0"/>
-                      <a:ext cx="5943600" cy="4245429"/>
+                      <a:ext cx="6400800" cy="4572000"/>
                     </a:xfrm>
                     <a:prstGeom prst="rect"/>
                   </pic:spPr>
@@ -1016,7 +1016,7 @@
       <w:r>
         <w:drawing>
           <wp:inline xmlns:a="http://schemas.openxmlformats.org/drawingml/2006/main" xmlns:pic="http://schemas.openxmlformats.org/drawingml/2006/picture">
-            <wp:extent cx="5943600" cy="4245429"/>
+            <wp:extent cx="6400800" cy="4572000"/>
             <wp:docPr id="17" name="Picture 17"/>
             <wp:cNvGraphicFramePr>
               <a:graphicFrameLocks noChangeAspect="1"/>
@@ -1037,7 +1037,7 @@
                   <pic:spPr>
                     <a:xfrm>
                       <a:off x="0" y="0"/>
-                      <a:ext cx="5943600" cy="4245429"/>
+                      <a:ext cx="6400800" cy="4572000"/>
                     </a:xfrm>
                     <a:prstGeom prst="rect"/>
                   </pic:spPr>
@@ -1099,7 +1099,7 @@
       <w:r>
         <w:drawing>
           <wp:inline xmlns:a="http://schemas.openxmlformats.org/drawingml/2006/main" xmlns:pic="http://schemas.openxmlformats.org/drawingml/2006/picture">
-            <wp:extent cx="5943600" cy="3962400"/>
+            <wp:extent cx="6400800" cy="4267200"/>
             <wp:docPr id="18" name="Picture 18"/>
             <wp:cNvGraphicFramePr>
               <a:graphicFrameLocks noChangeAspect="1"/>
@@ -1120,7 +1120,7 @@
                   <pic:spPr>
                     <a:xfrm>
                       <a:off x="0" y="0"/>
-                      <a:ext cx="5943600" cy="3962400"/>
+                      <a:ext cx="6400800" cy="4267200"/>
                     </a:xfrm>
                     <a:prstGeom prst="rect"/>
                   </pic:spPr>
@@ -1885,7 +1885,7 @@
       <w:r>
         <w:drawing>
           <wp:inline xmlns:a="http://schemas.openxmlformats.org/drawingml/2006/main" xmlns:pic="http://schemas.openxmlformats.org/drawingml/2006/picture">
-            <wp:extent cx="5943600" cy="4245429"/>
+            <wp:extent cx="6400800" cy="4572000"/>
             <wp:docPr id="19" name="Picture 19"/>
             <wp:cNvGraphicFramePr>
               <a:graphicFrameLocks noChangeAspect="1"/>
@@ -1906,7 +1906,7 @@
                   <pic:spPr>
                     <a:xfrm>
                       <a:off x="0" y="0"/>
-                      <a:ext cx="5943600" cy="4245429"/>
+                      <a:ext cx="6400800" cy="4572000"/>
                     </a:xfrm>
                     <a:prstGeom prst="rect"/>
                   </pic:spPr>
@@ -1950,7 +1950,7 @@
       <w:r>
         <w:drawing>
           <wp:inline xmlns:a="http://schemas.openxmlformats.org/drawingml/2006/main" xmlns:pic="http://schemas.openxmlformats.org/drawingml/2006/picture">
-            <wp:extent cx="5943600" cy="4245429"/>
+            <wp:extent cx="6400800" cy="4572000"/>
             <wp:docPr id="20" name="Picture 20"/>
             <wp:cNvGraphicFramePr>
               <a:graphicFrameLocks noChangeAspect="1"/>
@@ -1971,7 +1971,7 @@
                   <pic:spPr>
                     <a:xfrm>
                       <a:off x="0" y="0"/>
-                      <a:ext cx="5943600" cy="4245429"/>
+                      <a:ext cx="6400800" cy="4572000"/>
                     </a:xfrm>
                     <a:prstGeom prst="rect"/>
                   </pic:spPr>
@@ -2917,12 +2917,22 @@
     </w:p>
     <w:p>
       <w:pPr>
+        <w:sectPr>
+          <w:pgSz w:w="12240" w:h="15840"/>
+          <w:pgMar w:top="1440" w:right="1800" w:bottom="1440" w:left="1800" w:header="720" w:footer="720" w:gutter="0"/>
+          <w:cols w:space="720"/>
+          <w:docGrid w:linePitch="360"/>
+        </w:sectPr>
+      </w:pPr>
+    </w:p>
+    <w:p>
+      <w:pPr>
         <w:jc w:val="center"/>
       </w:pPr>
       <w:r>
         <w:drawing>
           <wp:inline xmlns:a="http://schemas.openxmlformats.org/drawingml/2006/main" xmlns:pic="http://schemas.openxmlformats.org/drawingml/2006/picture">
-            <wp:extent cx="5943600" cy="2161309"/>
+            <wp:extent cx="9144000" cy="3556000"/>
             <wp:docPr id="21" name="Picture 21"/>
             <wp:cNvGraphicFramePr>
               <a:graphicFrameLocks noChangeAspect="1"/>
@@ -2943,7 +2953,7 @@
                   <pic:spPr>
                     <a:xfrm>
                       <a:off x="0" y="0"/>
-                      <a:ext cx="5943600" cy="2161309"/>
+                      <a:ext cx="9144000" cy="3556000"/>
                     </a:xfrm>
                     <a:prstGeom prst="rect"/>
                   </pic:spPr>
@@ -2969,6 +2979,17 @@
     <w:p/>
     <w:p>
       <w:pPr>
+        <w:sectPr>
+          <w:type w:val="nextPage"/>
+          <w:pgSz w:w="15840" w:h="12240" w:orient="landscape"/>
+          <w:pgMar w:top="1440" w:right="720" w:bottom="1440" w:left="720" w:header="720" w:footer="720" w:gutter="0"/>
+          <w:cols w:space="720"/>
+          <w:docGrid w:linePitch="360"/>
+        </w:sectPr>
+      </w:pPr>
+    </w:p>
+    <w:p>
+      <w:pPr>
         <w:jc w:val="center"/>
       </w:pPr>
       <w:r>
@@ -2987,16 +3008,16 @@
         <w:tblLook w:firstColumn="1" w:firstRow="1" w:lastColumn="0" w:lastRow="0" w:noHBand="0" w:noVBand="1" w:val="04A0"/>
       </w:tblPr>
       <w:tblGrid>
-        <w:gridCol w:w="1728"/>
-        <w:gridCol w:w="1728"/>
-        <w:gridCol w:w="1728"/>
-        <w:gridCol w:w="1728"/>
-        <w:gridCol w:w="1728"/>
+        <w:gridCol w:w="1872"/>
+        <w:gridCol w:w="1872"/>
+        <w:gridCol w:w="1872"/>
+        <w:gridCol w:w="1872"/>
+        <w:gridCol w:w="1872"/>
       </w:tblGrid>
       <w:tr>
         <w:tc>
           <w:tcPr>
-            <w:tcW w:type="dxa" w:w="1728"/>
+            <w:tcW w:type="dxa" w:w="1872"/>
           </w:tcPr>
           <w:p>
             <w:pPr>
@@ -3013,7 +3034,7 @@
         </w:tc>
         <w:tc>
           <w:tcPr>
-            <w:tcW w:type="dxa" w:w="1728"/>
+            <w:tcW w:type="dxa" w:w="1872"/>
           </w:tcPr>
           <w:p>
             <w:pPr>
@@ -3030,7 +3051,7 @@
         </w:tc>
         <w:tc>
           <w:tcPr>
-            <w:tcW w:type="dxa" w:w="1728"/>
+            <w:tcW w:type="dxa" w:w="1872"/>
           </w:tcPr>
           <w:p>
             <w:pPr>
@@ -3047,7 +3068,7 @@
         </w:tc>
         <w:tc>
           <w:tcPr>
-            <w:tcW w:type="dxa" w:w="1728"/>
+            <w:tcW w:type="dxa" w:w="1872"/>
           </w:tcPr>
           <w:p>
             <w:pPr>
@@ -3064,7 +3085,7 @@
         </w:tc>
         <w:tc>
           <w:tcPr>
-            <w:tcW w:type="dxa" w:w="1728"/>
+            <w:tcW w:type="dxa" w:w="1872"/>
           </w:tcPr>
           <w:p>
             <w:pPr>
@@ -3083,7 +3104,7 @@
       <w:tr>
         <w:tc>
           <w:tcPr>
-            <w:tcW w:type="dxa" w:w="1728"/>
+            <w:tcW w:type="dxa" w:w="1872"/>
           </w:tcPr>
           <w:p>
             <w:pPr>
@@ -3099,7 +3120,7 @@
         </w:tc>
         <w:tc>
           <w:tcPr>
-            <w:tcW w:type="dxa" w:w="1728"/>
+            <w:tcW w:type="dxa" w:w="1872"/>
           </w:tcPr>
           <w:p>
             <w:pPr>
@@ -3115,7 +3136,7 @@
         </w:tc>
         <w:tc>
           <w:tcPr>
-            <w:tcW w:type="dxa" w:w="1728"/>
+            <w:tcW w:type="dxa" w:w="1872"/>
           </w:tcPr>
           <w:p>
             <w:pPr>
@@ -3131,7 +3152,7 @@
         </w:tc>
         <w:tc>
           <w:tcPr>
-            <w:tcW w:type="dxa" w:w="1728"/>
+            <w:tcW w:type="dxa" w:w="1872"/>
           </w:tcPr>
           <w:p>
             <w:pPr>
@@ -3147,7 +3168,7 @@
         </w:tc>
         <w:tc>
           <w:tcPr>
-            <w:tcW w:type="dxa" w:w="1728"/>
+            <w:tcW w:type="dxa" w:w="1872"/>
           </w:tcPr>
           <w:p>
             <w:pPr>
@@ -3165,7 +3186,7 @@
       <w:tr>
         <w:tc>
           <w:tcPr>
-            <w:tcW w:type="dxa" w:w="1728"/>
+            <w:tcW w:type="dxa" w:w="1872"/>
           </w:tcPr>
           <w:p>
             <w:pPr>
@@ -3181,7 +3202,7 @@
         </w:tc>
         <w:tc>
           <w:tcPr>
-            <w:tcW w:type="dxa" w:w="1728"/>
+            <w:tcW w:type="dxa" w:w="1872"/>
           </w:tcPr>
           <w:p>
             <w:pPr>
@@ -3197,7 +3218,7 @@
         </w:tc>
         <w:tc>
           <w:tcPr>
-            <w:tcW w:type="dxa" w:w="1728"/>
+            <w:tcW w:type="dxa" w:w="1872"/>
           </w:tcPr>
           <w:p>
             <w:pPr>
@@ -3213,7 +3234,7 @@
         </w:tc>
         <w:tc>
           <w:tcPr>
-            <w:tcW w:type="dxa" w:w="1728"/>
+            <w:tcW w:type="dxa" w:w="1872"/>
           </w:tcPr>
           <w:p>
             <w:pPr>
@@ -3229,7 +3250,7 @@
         </w:tc>
         <w:tc>
           <w:tcPr>
-            <w:tcW w:type="dxa" w:w="1728"/>
+            <w:tcW w:type="dxa" w:w="1872"/>
           </w:tcPr>
           <w:p>
             <w:pPr>
@@ -3247,7 +3268,7 @@
       <w:tr>
         <w:tc>
           <w:tcPr>
-            <w:tcW w:type="dxa" w:w="1728"/>
+            <w:tcW w:type="dxa" w:w="1872"/>
           </w:tcPr>
           <w:p>
             <w:pPr>
@@ -3263,7 +3284,7 @@
         </w:tc>
         <w:tc>
           <w:tcPr>
-            <w:tcW w:type="dxa" w:w="1728"/>
+            <w:tcW w:type="dxa" w:w="1872"/>
           </w:tcPr>
           <w:p>
             <w:pPr>
@@ -3279,7 +3300,7 @@
         </w:tc>
         <w:tc>
           <w:tcPr>
-            <w:tcW w:type="dxa" w:w="1728"/>
+            <w:tcW w:type="dxa" w:w="1872"/>
           </w:tcPr>
           <w:p>
             <w:pPr>
@@ -3295,7 +3316,7 @@
         </w:tc>
         <w:tc>
           <w:tcPr>
-            <w:tcW w:type="dxa" w:w="1728"/>
+            <w:tcW w:type="dxa" w:w="1872"/>
           </w:tcPr>
           <w:p>
             <w:pPr>
@@ -3311,7 +3332,7 @@
         </w:tc>
         <w:tc>
           <w:tcPr>
-            <w:tcW w:type="dxa" w:w="1728"/>
+            <w:tcW w:type="dxa" w:w="1872"/>
           </w:tcPr>
           <w:p>
             <w:pPr>
@@ -3329,7 +3350,7 @@
       <w:tr>
         <w:tc>
           <w:tcPr>
-            <w:tcW w:type="dxa" w:w="1728"/>
+            <w:tcW w:type="dxa" w:w="1872"/>
           </w:tcPr>
           <w:p>
             <w:pPr>
@@ -3345,7 +3366,7 @@
         </w:tc>
         <w:tc>
           <w:tcPr>
-            <w:tcW w:type="dxa" w:w="1728"/>
+            <w:tcW w:type="dxa" w:w="1872"/>
           </w:tcPr>
           <w:p>
             <w:pPr>
@@ -3361,7 +3382,7 @@
         </w:tc>
         <w:tc>
           <w:tcPr>
-            <w:tcW w:type="dxa" w:w="1728"/>
+            <w:tcW w:type="dxa" w:w="1872"/>
           </w:tcPr>
           <w:p>
             <w:pPr>
@@ -3377,7 +3398,7 @@
         </w:tc>
         <w:tc>
           <w:tcPr>
-            <w:tcW w:type="dxa" w:w="1728"/>
+            <w:tcW w:type="dxa" w:w="1872"/>
           </w:tcPr>
           <w:p>
             <w:pPr>
@@ -3393,7 +3414,7 @@
         </w:tc>
         <w:tc>
           <w:tcPr>
-            <w:tcW w:type="dxa" w:w="1728"/>
+            <w:tcW w:type="dxa" w:w="1872"/>
           </w:tcPr>
           <w:p>
             <w:pPr>
@@ -3411,7 +3432,7 @@
       <w:tr>
         <w:tc>
           <w:tcPr>
-            <w:tcW w:type="dxa" w:w="1728"/>
+            <w:tcW w:type="dxa" w:w="1872"/>
           </w:tcPr>
           <w:p>
             <w:pPr>
@@ -3427,7 +3448,7 @@
         </w:tc>
         <w:tc>
           <w:tcPr>
-            <w:tcW w:type="dxa" w:w="1728"/>
+            <w:tcW w:type="dxa" w:w="1872"/>
           </w:tcPr>
           <w:p>
             <w:pPr>
@@ -3443,7 +3464,7 @@
         </w:tc>
         <w:tc>
           <w:tcPr>
-            <w:tcW w:type="dxa" w:w="1728"/>
+            <w:tcW w:type="dxa" w:w="1872"/>
           </w:tcPr>
           <w:p>
             <w:pPr>
@@ -3459,7 +3480,7 @@
         </w:tc>
         <w:tc>
           <w:tcPr>
-            <w:tcW w:type="dxa" w:w="1728"/>
+            <w:tcW w:type="dxa" w:w="1872"/>
           </w:tcPr>
           <w:p>
             <w:pPr>
@@ -3475,7 +3496,7 @@
         </w:tc>
         <w:tc>
           <w:tcPr>
-            <w:tcW w:type="dxa" w:w="1728"/>
+            <w:tcW w:type="dxa" w:w="1872"/>
           </w:tcPr>
           <w:p>
             <w:pPr>
@@ -3493,7 +3514,7 @@
       <w:tr>
         <w:tc>
           <w:tcPr>
-            <w:tcW w:type="dxa" w:w="1728"/>
+            <w:tcW w:type="dxa" w:w="1872"/>
           </w:tcPr>
           <w:p>
             <w:pPr>
@@ -3509,7 +3530,7 @@
         </w:tc>
         <w:tc>
           <w:tcPr>
-            <w:tcW w:type="dxa" w:w="1728"/>
+            <w:tcW w:type="dxa" w:w="1872"/>
           </w:tcPr>
           <w:p>
             <w:pPr>
@@ -3525,7 +3546,7 @@
         </w:tc>
         <w:tc>
           <w:tcPr>
-            <w:tcW w:type="dxa" w:w="1728"/>
+            <w:tcW w:type="dxa" w:w="1872"/>
           </w:tcPr>
           <w:p>
             <w:pPr>
@@ -3541,7 +3562,7 @@
         </w:tc>
         <w:tc>
           <w:tcPr>
-            <w:tcW w:type="dxa" w:w="1728"/>
+            <w:tcW w:type="dxa" w:w="1872"/>
           </w:tcPr>
           <w:p>
             <w:pPr>
@@ -3557,7 +3578,7 @@
         </w:tc>
         <w:tc>
           <w:tcPr>
-            <w:tcW w:type="dxa" w:w="1728"/>
+            <w:tcW w:type="dxa" w:w="1872"/>
           </w:tcPr>
           <w:p>
             <w:pPr>
@@ -3589,12 +3610,23 @@
     </w:p>
     <w:p>
       <w:pPr>
+        <w:sectPr>
+          <w:type w:val="nextPage"/>
+          <w:pgSz w:w="12240" w:h="15840"/>
+          <w:pgMar w:top="1440" w:right="1440" w:bottom="1440" w:left="1440" w:header="720" w:footer="720" w:gutter="0"/>
+          <w:cols w:space="720"/>
+          <w:docGrid w:linePitch="360"/>
+        </w:sectPr>
+      </w:pPr>
+    </w:p>
+    <w:p>
+      <w:pPr>
         <w:jc w:val="center"/>
       </w:pPr>
       <w:r>
         <w:drawing>
           <wp:inline xmlns:a="http://schemas.openxmlformats.org/drawingml/2006/main" xmlns:pic="http://schemas.openxmlformats.org/drawingml/2006/picture">
-            <wp:extent cx="5943600" cy="1485900"/>
+            <wp:extent cx="9144000" cy="2667000"/>
             <wp:docPr id="22" name="Picture 22"/>
             <wp:cNvGraphicFramePr>
               <a:graphicFrameLocks noChangeAspect="1"/>
@@ -3615,7 +3647,7 @@
                   <pic:spPr>
                     <a:xfrm>
                       <a:off x="0" y="0"/>
-                      <a:ext cx="5943600" cy="1485900"/>
+                      <a:ext cx="9144000" cy="2667000"/>
                     </a:xfrm>
                     <a:prstGeom prst="rect"/>
                   </pic:spPr>
@@ -3641,6 +3673,17 @@
     <w:p/>
     <w:p>
       <w:pPr>
+        <w:sectPr>
+          <w:type w:val="nextPage"/>
+          <w:pgSz w:w="15840" w:h="12240" w:orient="landscape"/>
+          <w:pgMar w:top="1440" w:right="720" w:bottom="1440" w:left="720" w:header="720" w:footer="720" w:gutter="0"/>
+          <w:cols w:space="720"/>
+          <w:docGrid w:linePitch="360"/>
+        </w:sectPr>
+      </w:pPr>
+    </w:p>
+    <w:p>
+      <w:pPr>
         <w:pStyle w:val="Heading3"/>
       </w:pPr>
       <w:r>
@@ -3654,12 +3697,23 @@
     </w:p>
     <w:p>
       <w:pPr>
+        <w:sectPr>
+          <w:type w:val="nextPage"/>
+          <w:pgSz w:w="12240" w:h="15840"/>
+          <w:pgMar w:top="1440" w:right="1440" w:bottom="1440" w:left="1440" w:header="720" w:footer="720" w:gutter="0"/>
+          <w:cols w:space="720"/>
+          <w:docGrid w:linePitch="360"/>
+        </w:sectPr>
+      </w:pPr>
+    </w:p>
+    <w:p>
+      <w:pPr>
         <w:jc w:val="center"/>
       </w:pPr>
       <w:r>
         <w:drawing>
           <wp:inline xmlns:a="http://schemas.openxmlformats.org/drawingml/2006/main" xmlns:pic="http://schemas.openxmlformats.org/drawingml/2006/picture">
-            <wp:extent cx="5943600" cy="1698171"/>
+            <wp:extent cx="9144000" cy="2909455"/>
             <wp:docPr id="23" name="Picture 23"/>
             <wp:cNvGraphicFramePr>
               <a:graphicFrameLocks noChangeAspect="1"/>
@@ -3680,7 +3734,7 @@
                   <pic:spPr>
                     <a:xfrm>
                       <a:off x="0" y="0"/>
-                      <a:ext cx="5943600" cy="1698171"/>
+                      <a:ext cx="9144000" cy="2909455"/>
                     </a:xfrm>
                     <a:prstGeom prst="rect"/>
                   </pic:spPr>
@@ -3706,6 +3760,17 @@
     <w:p/>
     <w:p>
       <w:pPr>
+        <w:sectPr>
+          <w:type w:val="nextPage"/>
+          <w:pgSz w:w="15840" w:h="12240" w:orient="landscape"/>
+          <w:pgMar w:top="1440" w:right="720" w:bottom="1440" w:left="720" w:header="720" w:footer="720" w:gutter="0"/>
+          <w:cols w:space="720"/>
+          <w:docGrid w:linePitch="360"/>
+        </w:sectPr>
+      </w:pPr>
+    </w:p>
+    <w:p>
+      <w:pPr>
         <w:jc w:val="center"/>
       </w:pPr>
       <w:r>
@@ -3724,16 +3789,16 @@
         <w:tblLook w:firstColumn="1" w:firstRow="1" w:lastColumn="0" w:lastRow="0" w:noHBand="0" w:noVBand="1" w:val="04A0"/>
       </w:tblPr>
       <w:tblGrid>
-        <w:gridCol w:w="1728"/>
-        <w:gridCol w:w="1728"/>
-        <w:gridCol w:w="1728"/>
-        <w:gridCol w:w="1728"/>
-        <w:gridCol w:w="1728"/>
+        <w:gridCol w:w="1872"/>
+        <w:gridCol w:w="1872"/>
+        <w:gridCol w:w="1872"/>
+        <w:gridCol w:w="1872"/>
+        <w:gridCol w:w="1872"/>
       </w:tblGrid>
       <w:tr>
         <w:tc>
           <w:tcPr>
-            <w:tcW w:type="dxa" w:w="1728"/>
+            <w:tcW w:type="dxa" w:w="1872"/>
           </w:tcPr>
           <w:p>
             <w:pPr>
@@ -3750,7 +3815,7 @@
         </w:tc>
         <w:tc>
           <w:tcPr>
-            <w:tcW w:type="dxa" w:w="1728"/>
+            <w:tcW w:type="dxa" w:w="1872"/>
           </w:tcPr>
           <w:p>
             <w:pPr>
@@ -3767,7 +3832,7 @@
         </w:tc>
         <w:tc>
           <w:tcPr>
-            <w:tcW w:type="dxa" w:w="1728"/>
+            <w:tcW w:type="dxa" w:w="1872"/>
           </w:tcPr>
           <w:p>
             <w:pPr>
@@ -3784,7 +3849,7 @@
         </w:tc>
         <w:tc>
           <w:tcPr>
-            <w:tcW w:type="dxa" w:w="1728"/>
+            <w:tcW w:type="dxa" w:w="1872"/>
           </w:tcPr>
           <w:p>
             <w:pPr>
@@ -3801,7 +3866,7 @@
         </w:tc>
         <w:tc>
           <w:tcPr>
-            <w:tcW w:type="dxa" w:w="1728"/>
+            <w:tcW w:type="dxa" w:w="1872"/>
           </w:tcPr>
           <w:p>
             <w:pPr>
@@ -3820,7 +3885,7 @@
       <w:tr>
         <w:tc>
           <w:tcPr>
-            <w:tcW w:type="dxa" w:w="1728"/>
+            <w:tcW w:type="dxa" w:w="1872"/>
           </w:tcPr>
           <w:p>
             <w:pPr>
@@ -3836,7 +3901,7 @@
         </w:tc>
         <w:tc>
           <w:tcPr>
-            <w:tcW w:type="dxa" w:w="1728"/>
+            <w:tcW w:type="dxa" w:w="1872"/>
           </w:tcPr>
           <w:p>
             <w:pPr>
@@ -3852,7 +3917,7 @@
         </w:tc>
         <w:tc>
           <w:tcPr>
-            <w:tcW w:type="dxa" w:w="1728"/>
+            <w:tcW w:type="dxa" w:w="1872"/>
           </w:tcPr>
           <w:p>
             <w:pPr>
@@ -3868,7 +3933,7 @@
         </w:tc>
         <w:tc>
           <w:tcPr>
-            <w:tcW w:type="dxa" w:w="1728"/>
+            <w:tcW w:type="dxa" w:w="1872"/>
           </w:tcPr>
           <w:p>
             <w:pPr>
@@ -3884,7 +3949,7 @@
         </w:tc>
         <w:tc>
           <w:tcPr>
-            <w:tcW w:type="dxa" w:w="1728"/>
+            <w:tcW w:type="dxa" w:w="1872"/>
           </w:tcPr>
           <w:p>
             <w:pPr>
@@ -3902,7 +3967,7 @@
       <w:tr>
         <w:tc>
           <w:tcPr>
-            <w:tcW w:type="dxa" w:w="1728"/>
+            <w:tcW w:type="dxa" w:w="1872"/>
           </w:tcPr>
           <w:p>
             <w:pPr>
@@ -3918,7 +3983,7 @@
         </w:tc>
         <w:tc>
           <w:tcPr>
-            <w:tcW w:type="dxa" w:w="1728"/>
+            <w:tcW w:type="dxa" w:w="1872"/>
           </w:tcPr>
           <w:p>
             <w:pPr>
@@ -3934,7 +3999,7 @@
         </w:tc>
         <w:tc>
           <w:tcPr>
-            <w:tcW w:type="dxa" w:w="1728"/>
+            <w:tcW w:type="dxa" w:w="1872"/>
           </w:tcPr>
           <w:p>
             <w:pPr>
@@ -3950,7 +4015,7 @@
         </w:tc>
         <w:tc>
           <w:tcPr>
-            <w:tcW w:type="dxa" w:w="1728"/>
+            <w:tcW w:type="dxa" w:w="1872"/>
           </w:tcPr>
           <w:p>
             <w:pPr>
@@ -3966,7 +4031,7 @@
         </w:tc>
         <w:tc>
           <w:tcPr>
-            <w:tcW w:type="dxa" w:w="1728"/>
+            <w:tcW w:type="dxa" w:w="1872"/>
           </w:tcPr>
           <w:p>
             <w:pPr>
@@ -3984,7 +4049,7 @@
       <w:tr>
         <w:tc>
           <w:tcPr>
-            <w:tcW w:type="dxa" w:w="1728"/>
+            <w:tcW w:type="dxa" w:w="1872"/>
           </w:tcPr>
           <w:p>
             <w:pPr>
@@ -4000,7 +4065,7 @@
         </w:tc>
         <w:tc>
           <w:tcPr>
-            <w:tcW w:type="dxa" w:w="1728"/>
+            <w:tcW w:type="dxa" w:w="1872"/>
           </w:tcPr>
           <w:p>
             <w:pPr>
@@ -4016,7 +4081,7 @@
         </w:tc>
         <w:tc>
           <w:tcPr>
-            <w:tcW w:type="dxa" w:w="1728"/>
+            <w:tcW w:type="dxa" w:w="1872"/>
           </w:tcPr>
           <w:p>
             <w:pPr>
@@ -4032,7 +4097,7 @@
         </w:tc>
         <w:tc>
           <w:tcPr>
-            <w:tcW w:type="dxa" w:w="1728"/>
+            <w:tcW w:type="dxa" w:w="1872"/>
           </w:tcPr>
           <w:p>
             <w:pPr>
@@ -4048,7 +4113,7 @@
         </w:tc>
         <w:tc>
           <w:tcPr>
-            <w:tcW w:type="dxa" w:w="1728"/>
+            <w:tcW w:type="dxa" w:w="1872"/>
           </w:tcPr>
           <w:p>
             <w:pPr>
@@ -4066,7 +4131,7 @@
       <w:tr>
         <w:tc>
           <w:tcPr>
-            <w:tcW w:type="dxa" w:w="1728"/>
+            <w:tcW w:type="dxa" w:w="1872"/>
           </w:tcPr>
           <w:p>
             <w:pPr>
@@ -4082,7 +4147,7 @@
         </w:tc>
         <w:tc>
           <w:tcPr>
-            <w:tcW w:type="dxa" w:w="1728"/>
+            <w:tcW w:type="dxa" w:w="1872"/>
           </w:tcPr>
           <w:p>
             <w:pPr>
@@ -4098,7 +4163,7 @@
         </w:tc>
         <w:tc>
           <w:tcPr>
-            <w:tcW w:type="dxa" w:w="1728"/>
+            <w:tcW w:type="dxa" w:w="1872"/>
           </w:tcPr>
           <w:p>
             <w:pPr>
@@ -4114,7 +4179,7 @@
         </w:tc>
         <w:tc>
           <w:tcPr>
-            <w:tcW w:type="dxa" w:w="1728"/>
+            <w:tcW w:type="dxa" w:w="1872"/>
           </w:tcPr>
           <w:p>
             <w:pPr>
@@ -4130,7 +4195,7 @@
         </w:tc>
         <w:tc>
           <w:tcPr>
-            <w:tcW w:type="dxa" w:w="1728"/>
+            <w:tcW w:type="dxa" w:w="1872"/>
           </w:tcPr>
           <w:p>
             <w:pPr>
@@ -4148,7 +4213,7 @@
       <w:tr>
         <w:tc>
           <w:tcPr>
-            <w:tcW w:type="dxa" w:w="1728"/>
+            <w:tcW w:type="dxa" w:w="1872"/>
           </w:tcPr>
           <w:p>
             <w:pPr>
@@ -4164,7 +4229,7 @@
         </w:tc>
         <w:tc>
           <w:tcPr>
-            <w:tcW w:type="dxa" w:w="1728"/>
+            <w:tcW w:type="dxa" w:w="1872"/>
           </w:tcPr>
           <w:p>
             <w:pPr>
@@ -4180,7 +4245,7 @@
         </w:tc>
         <w:tc>
           <w:tcPr>
-            <w:tcW w:type="dxa" w:w="1728"/>
+            <w:tcW w:type="dxa" w:w="1872"/>
           </w:tcPr>
           <w:p>
             <w:pPr>
@@ -4196,7 +4261,7 @@
         </w:tc>
         <w:tc>
           <w:tcPr>
-            <w:tcW w:type="dxa" w:w="1728"/>
+            <w:tcW w:type="dxa" w:w="1872"/>
           </w:tcPr>
           <w:p>
             <w:pPr>
@@ -4212,7 +4277,7 @@
         </w:tc>
         <w:tc>
           <w:tcPr>
-            <w:tcW w:type="dxa" w:w="1728"/>
+            <w:tcW w:type="dxa" w:w="1872"/>
           </w:tcPr>
           <w:p>
             <w:pPr>
@@ -4230,7 +4295,7 @@
       <w:tr>
         <w:tc>
           <w:tcPr>
-            <w:tcW w:type="dxa" w:w="1728"/>
+            <w:tcW w:type="dxa" w:w="1872"/>
           </w:tcPr>
           <w:p>
             <w:pPr>
@@ -4246,7 +4311,7 @@
         </w:tc>
         <w:tc>
           <w:tcPr>
-            <w:tcW w:type="dxa" w:w="1728"/>
+            <w:tcW w:type="dxa" w:w="1872"/>
           </w:tcPr>
           <w:p>
             <w:pPr>
@@ -4262,7 +4327,7 @@
         </w:tc>
         <w:tc>
           <w:tcPr>
-            <w:tcW w:type="dxa" w:w="1728"/>
+            <w:tcW w:type="dxa" w:w="1872"/>
           </w:tcPr>
           <w:p>
             <w:pPr>
@@ -4278,7 +4343,7 @@
         </w:tc>
         <w:tc>
           <w:tcPr>
-            <w:tcW w:type="dxa" w:w="1728"/>
+            <w:tcW w:type="dxa" w:w="1872"/>
           </w:tcPr>
           <w:p>
             <w:pPr>
@@ -4294,7 +4359,7 @@
         </w:tc>
         <w:tc>
           <w:tcPr>
-            <w:tcW w:type="dxa" w:w="1728"/>
+            <w:tcW w:type="dxa" w:w="1872"/>
           </w:tcPr>
           <w:p>
             <w:pPr>
@@ -4312,7 +4377,7 @@
       <w:tr>
         <w:tc>
           <w:tcPr>
-            <w:tcW w:type="dxa" w:w="1728"/>
+            <w:tcW w:type="dxa" w:w="1872"/>
           </w:tcPr>
           <w:p>
             <w:pPr>
@@ -4328,7 +4393,7 @@
         </w:tc>
         <w:tc>
           <w:tcPr>
-            <w:tcW w:type="dxa" w:w="1728"/>
+            <w:tcW w:type="dxa" w:w="1872"/>
           </w:tcPr>
           <w:p>
             <w:pPr>
@@ -4344,7 +4409,7 @@
         </w:tc>
         <w:tc>
           <w:tcPr>
-            <w:tcW w:type="dxa" w:w="1728"/>
+            <w:tcW w:type="dxa" w:w="1872"/>
           </w:tcPr>
           <w:p>
             <w:pPr>
@@ -4360,7 +4425,7 @@
         </w:tc>
         <w:tc>
           <w:tcPr>
-            <w:tcW w:type="dxa" w:w="1728"/>
+            <w:tcW w:type="dxa" w:w="1872"/>
           </w:tcPr>
           <w:p>
             <w:pPr>
@@ -4376,7 +4441,7 @@
         </w:tc>
         <w:tc>
           <w:tcPr>
-            <w:tcW w:type="dxa" w:w="1728"/>
+            <w:tcW w:type="dxa" w:w="1872"/>
           </w:tcPr>
           <w:p>
             <w:pPr>
@@ -4394,7 +4459,7 @@
       <w:tr>
         <w:tc>
           <w:tcPr>
-            <w:tcW w:type="dxa" w:w="1728"/>
+            <w:tcW w:type="dxa" w:w="1872"/>
           </w:tcPr>
           <w:p>
             <w:pPr>
@@ -4410,7 +4475,7 @@
         </w:tc>
         <w:tc>
           <w:tcPr>
-            <w:tcW w:type="dxa" w:w="1728"/>
+            <w:tcW w:type="dxa" w:w="1872"/>
           </w:tcPr>
           <w:p>
             <w:pPr>
@@ -4426,7 +4491,7 @@
         </w:tc>
         <w:tc>
           <w:tcPr>
-            <w:tcW w:type="dxa" w:w="1728"/>
+            <w:tcW w:type="dxa" w:w="1872"/>
           </w:tcPr>
           <w:p>
             <w:pPr>
@@ -4442,7 +4507,7 @@
         </w:tc>
         <w:tc>
           <w:tcPr>
-            <w:tcW w:type="dxa" w:w="1728"/>
+            <w:tcW w:type="dxa" w:w="1872"/>
           </w:tcPr>
           <w:p>
             <w:pPr>
@@ -4458,7 +4523,7 @@
         </w:tc>
         <w:tc>
           <w:tcPr>
-            <w:tcW w:type="dxa" w:w="1728"/>
+            <w:tcW w:type="dxa" w:w="1872"/>
           </w:tcPr>
           <w:p>
             <w:pPr>
@@ -4476,7 +4541,7 @@
       <w:tr>
         <w:tc>
           <w:tcPr>
-            <w:tcW w:type="dxa" w:w="1728"/>
+            <w:tcW w:type="dxa" w:w="1872"/>
           </w:tcPr>
           <w:p>
             <w:pPr>
@@ -4492,7 +4557,7 @@
         </w:tc>
         <w:tc>
           <w:tcPr>
-            <w:tcW w:type="dxa" w:w="1728"/>
+            <w:tcW w:type="dxa" w:w="1872"/>
           </w:tcPr>
           <w:p>
             <w:pPr>
@@ -4508,7 +4573,7 @@
         </w:tc>
         <w:tc>
           <w:tcPr>
-            <w:tcW w:type="dxa" w:w="1728"/>
+            <w:tcW w:type="dxa" w:w="1872"/>
           </w:tcPr>
           <w:p>
             <w:pPr>
@@ -4524,7 +4589,7 @@
         </w:tc>
         <w:tc>
           <w:tcPr>
-            <w:tcW w:type="dxa" w:w="1728"/>
+            <w:tcW w:type="dxa" w:w="1872"/>
           </w:tcPr>
           <w:p>
             <w:pPr>
@@ -4540,7 +4605,7 @@
         </w:tc>
         <w:tc>
           <w:tcPr>
-            <w:tcW w:type="dxa" w:w="1728"/>
+            <w:tcW w:type="dxa" w:w="1872"/>
           </w:tcPr>
           <w:p>
             <w:pPr>
@@ -4558,7 +4623,7 @@
       <w:tr>
         <w:tc>
           <w:tcPr>
-            <w:tcW w:type="dxa" w:w="1728"/>
+            <w:tcW w:type="dxa" w:w="1872"/>
           </w:tcPr>
           <w:p>
             <w:pPr>
@@ -4574,7 +4639,7 @@
         </w:tc>
         <w:tc>
           <w:tcPr>
-            <w:tcW w:type="dxa" w:w="1728"/>
+            <w:tcW w:type="dxa" w:w="1872"/>
           </w:tcPr>
           <w:p>
             <w:pPr>
@@ -4590,7 +4655,7 @@
         </w:tc>
         <w:tc>
           <w:tcPr>
-            <w:tcW w:type="dxa" w:w="1728"/>
+            <w:tcW w:type="dxa" w:w="1872"/>
           </w:tcPr>
           <w:p>
             <w:pPr>
@@ -4606,7 +4671,7 @@
         </w:tc>
         <w:tc>
           <w:tcPr>
-            <w:tcW w:type="dxa" w:w="1728"/>
+            <w:tcW w:type="dxa" w:w="1872"/>
           </w:tcPr>
           <w:p>
             <w:pPr>
@@ -4622,7 +4687,7 @@
         </w:tc>
         <w:tc>
           <w:tcPr>
-            <w:tcW w:type="dxa" w:w="1728"/>
+            <w:tcW w:type="dxa" w:w="1872"/>
           </w:tcPr>
           <w:p>
             <w:pPr>
@@ -4640,7 +4705,7 @@
       <w:tr>
         <w:tc>
           <w:tcPr>
-            <w:tcW w:type="dxa" w:w="1728"/>
+            <w:tcW w:type="dxa" w:w="1872"/>
           </w:tcPr>
           <w:p>
             <w:pPr>
@@ -4656,7 +4721,7 @@
         </w:tc>
         <w:tc>
           <w:tcPr>
-            <w:tcW w:type="dxa" w:w="1728"/>
+            <w:tcW w:type="dxa" w:w="1872"/>
           </w:tcPr>
           <w:p>
             <w:pPr>
@@ -4672,7 +4737,7 @@
         </w:tc>
         <w:tc>
           <w:tcPr>
-            <w:tcW w:type="dxa" w:w="1728"/>
+            <w:tcW w:type="dxa" w:w="1872"/>
           </w:tcPr>
           <w:p>
             <w:pPr>
@@ -4688,7 +4753,7 @@
         </w:tc>
         <w:tc>
           <w:tcPr>
-            <w:tcW w:type="dxa" w:w="1728"/>
+            <w:tcW w:type="dxa" w:w="1872"/>
           </w:tcPr>
           <w:p>
             <w:pPr>
@@ -4704,7 +4769,7 @@
         </w:tc>
         <w:tc>
           <w:tcPr>
-            <w:tcW w:type="dxa" w:w="1728"/>
+            <w:tcW w:type="dxa" w:w="1872"/>
           </w:tcPr>
           <w:p>
             <w:pPr>
@@ -4722,7 +4787,7 @@
       <w:tr>
         <w:tc>
           <w:tcPr>
-            <w:tcW w:type="dxa" w:w="1728"/>
+            <w:tcW w:type="dxa" w:w="1872"/>
           </w:tcPr>
           <w:p>
             <w:pPr>
@@ -4738,7 +4803,7 @@
         </w:tc>
         <w:tc>
           <w:tcPr>
-            <w:tcW w:type="dxa" w:w="1728"/>
+            <w:tcW w:type="dxa" w:w="1872"/>
           </w:tcPr>
           <w:p>
             <w:pPr>
@@ -4754,7 +4819,7 @@
         </w:tc>
         <w:tc>
           <w:tcPr>
-            <w:tcW w:type="dxa" w:w="1728"/>
+            <w:tcW w:type="dxa" w:w="1872"/>
           </w:tcPr>
           <w:p>
             <w:pPr>
@@ -4770,7 +4835,7 @@
         </w:tc>
         <w:tc>
           <w:tcPr>
-            <w:tcW w:type="dxa" w:w="1728"/>
+            <w:tcW w:type="dxa" w:w="1872"/>
           </w:tcPr>
           <w:p>
             <w:pPr>
@@ -4786,7 +4851,7 @@
         </w:tc>
         <w:tc>
           <w:tcPr>
-            <w:tcW w:type="dxa" w:w="1728"/>
+            <w:tcW w:type="dxa" w:w="1872"/>
           </w:tcPr>
           <w:p>
             <w:pPr>
@@ -4836,12 +4901,23 @@
     </w:p>
     <w:p>
       <w:pPr>
+        <w:sectPr>
+          <w:type w:val="nextPage"/>
+          <w:pgSz w:w="12240" w:h="15840"/>
+          <w:pgMar w:top="1440" w:right="1440" w:bottom="1440" w:left="1440" w:header="720" w:footer="720" w:gutter="0"/>
+          <w:cols w:space="720"/>
+          <w:docGrid w:linePitch="360"/>
+        </w:sectPr>
+      </w:pPr>
+    </w:p>
+    <w:p>
+      <w:pPr>
         <w:jc w:val="center"/>
       </w:pPr>
       <w:r>
         <w:drawing>
           <wp:inline xmlns:a="http://schemas.openxmlformats.org/drawingml/2006/main" xmlns:pic="http://schemas.openxmlformats.org/drawingml/2006/picture">
-            <wp:extent cx="5943600" cy="3241964"/>
+            <wp:extent cx="9144000" cy="4987636"/>
             <wp:docPr id="24" name="Picture 24"/>
             <wp:cNvGraphicFramePr>
               <a:graphicFrameLocks noChangeAspect="1"/>
@@ -4862,7 +4938,7 @@
                   <pic:spPr>
                     <a:xfrm>
                       <a:off x="0" y="0"/>
-                      <a:ext cx="5943600" cy="3241964"/>
+                      <a:ext cx="9144000" cy="4987636"/>
                     </a:xfrm>
                     <a:prstGeom prst="rect"/>
                   </pic:spPr>
@@ -4888,6 +4964,17 @@
     <w:p/>
     <w:p>
       <w:pPr>
+        <w:sectPr>
+          <w:type w:val="nextPage"/>
+          <w:pgSz w:w="15840" w:h="12240" w:orient="landscape"/>
+          <w:pgMar w:top="1440" w:right="720" w:bottom="1440" w:left="720" w:header="720" w:footer="720" w:gutter="0"/>
+          <w:cols w:space="720"/>
+          <w:docGrid w:linePitch="360"/>
+        </w:sectPr>
+      </w:pPr>
+    </w:p>
+    <w:p>
+      <w:pPr>
         <w:jc w:val="center"/>
       </w:pPr>
       <w:r>
@@ -4906,16 +4993,16 @@
         <w:tblLook w:firstColumn="1" w:firstRow="1" w:lastColumn="0" w:lastRow="0" w:noHBand="0" w:noVBand="1" w:val="04A0"/>
       </w:tblPr>
       <w:tblGrid>
-        <w:gridCol w:w="1728"/>
-        <w:gridCol w:w="1728"/>
-        <w:gridCol w:w="1728"/>
-        <w:gridCol w:w="1728"/>
-        <w:gridCol w:w="1728"/>
+        <w:gridCol w:w="1872"/>
+        <w:gridCol w:w="1872"/>
+        <w:gridCol w:w="1872"/>
+        <w:gridCol w:w="1872"/>
+        <w:gridCol w:w="1872"/>
       </w:tblGrid>
       <w:tr>
         <w:tc>
           <w:tcPr>
-            <w:tcW w:type="dxa" w:w="1728"/>
+            <w:tcW w:type="dxa" w:w="1872"/>
           </w:tcPr>
           <w:p>
             <w:pPr>
@@ -4932,7 +5019,7 @@
         </w:tc>
         <w:tc>
           <w:tcPr>
-            <w:tcW w:type="dxa" w:w="1728"/>
+            <w:tcW w:type="dxa" w:w="1872"/>
           </w:tcPr>
           <w:p>
             <w:pPr>
@@ -4949,7 +5036,7 @@
         </w:tc>
         <w:tc>
           <w:tcPr>
-            <w:tcW w:type="dxa" w:w="1728"/>
+            <w:tcW w:type="dxa" w:w="1872"/>
           </w:tcPr>
           <w:p>
             <w:pPr>
@@ -4966,7 +5053,7 @@
         </w:tc>
         <w:tc>
           <w:tcPr>
-            <w:tcW w:type="dxa" w:w="1728"/>
+            <w:tcW w:type="dxa" w:w="1872"/>
           </w:tcPr>
           <w:p>
             <w:pPr>
@@ -4983,7 +5070,7 @@
         </w:tc>
         <w:tc>
           <w:tcPr>
-            <w:tcW w:type="dxa" w:w="1728"/>
+            <w:tcW w:type="dxa" w:w="1872"/>
           </w:tcPr>
           <w:p>
             <w:pPr>
@@ -5002,7 +5089,7 @@
       <w:tr>
         <w:tc>
           <w:tcPr>
-            <w:tcW w:type="dxa" w:w="1728"/>
+            <w:tcW w:type="dxa" w:w="1872"/>
           </w:tcPr>
           <w:p>
             <w:pPr>
@@ -5018,7 +5105,7 @@
         </w:tc>
         <w:tc>
           <w:tcPr>
-            <w:tcW w:type="dxa" w:w="1728"/>
+            <w:tcW w:type="dxa" w:w="1872"/>
           </w:tcPr>
           <w:p>
             <w:pPr>
@@ -5034,7 +5121,7 @@
         </w:tc>
         <w:tc>
           <w:tcPr>
-            <w:tcW w:type="dxa" w:w="1728"/>
+            <w:tcW w:type="dxa" w:w="1872"/>
           </w:tcPr>
           <w:p>
             <w:pPr>
@@ -5050,7 +5137,7 @@
         </w:tc>
         <w:tc>
           <w:tcPr>
-            <w:tcW w:type="dxa" w:w="1728"/>
+            <w:tcW w:type="dxa" w:w="1872"/>
           </w:tcPr>
           <w:p>
             <w:pPr>
@@ -5066,7 +5153,7 @@
         </w:tc>
         <w:tc>
           <w:tcPr>
-            <w:tcW w:type="dxa" w:w="1728"/>
+            <w:tcW w:type="dxa" w:w="1872"/>
           </w:tcPr>
           <w:p>
             <w:pPr>
@@ -5084,7 +5171,7 @@
       <w:tr>
         <w:tc>
           <w:tcPr>
-            <w:tcW w:type="dxa" w:w="1728"/>
+            <w:tcW w:type="dxa" w:w="1872"/>
           </w:tcPr>
           <w:p>
             <w:pPr>
@@ -5100,7 +5187,7 @@
         </w:tc>
         <w:tc>
           <w:tcPr>
-            <w:tcW w:type="dxa" w:w="1728"/>
+            <w:tcW w:type="dxa" w:w="1872"/>
           </w:tcPr>
           <w:p>
             <w:pPr>
@@ -5116,7 +5203,7 @@
         </w:tc>
         <w:tc>
           <w:tcPr>
-            <w:tcW w:type="dxa" w:w="1728"/>
+            <w:tcW w:type="dxa" w:w="1872"/>
           </w:tcPr>
           <w:p>
             <w:pPr>
@@ -5132,7 +5219,7 @@
         </w:tc>
         <w:tc>
           <w:tcPr>
-            <w:tcW w:type="dxa" w:w="1728"/>
+            <w:tcW w:type="dxa" w:w="1872"/>
           </w:tcPr>
           <w:p>
             <w:pPr>
@@ -5148,7 +5235,7 @@
         </w:tc>
         <w:tc>
           <w:tcPr>
-            <w:tcW w:type="dxa" w:w="1728"/>
+            <w:tcW w:type="dxa" w:w="1872"/>
           </w:tcPr>
           <w:p>
             <w:pPr>
@@ -5166,7 +5253,7 @@
       <w:tr>
         <w:tc>
           <w:tcPr>
-            <w:tcW w:type="dxa" w:w="1728"/>
+            <w:tcW w:type="dxa" w:w="1872"/>
           </w:tcPr>
           <w:p>
             <w:pPr>
@@ -5182,7 +5269,7 @@
         </w:tc>
         <w:tc>
           <w:tcPr>
-            <w:tcW w:type="dxa" w:w="1728"/>
+            <w:tcW w:type="dxa" w:w="1872"/>
           </w:tcPr>
           <w:p>
             <w:pPr>
@@ -5198,7 +5285,7 @@
         </w:tc>
         <w:tc>
           <w:tcPr>
-            <w:tcW w:type="dxa" w:w="1728"/>
+            <w:tcW w:type="dxa" w:w="1872"/>
           </w:tcPr>
           <w:p>
             <w:pPr>
@@ -5214,7 +5301,7 @@
         </w:tc>
         <w:tc>
           <w:tcPr>
-            <w:tcW w:type="dxa" w:w="1728"/>
+            <w:tcW w:type="dxa" w:w="1872"/>
           </w:tcPr>
           <w:p>
             <w:pPr>
@@ -5230,7 +5317,7 @@
         </w:tc>
         <w:tc>
           <w:tcPr>
-            <w:tcW w:type="dxa" w:w="1728"/>
+            <w:tcW w:type="dxa" w:w="1872"/>
           </w:tcPr>
           <w:p>
             <w:pPr>
@@ -5248,7 +5335,7 @@
       <w:tr>
         <w:tc>
           <w:tcPr>
-            <w:tcW w:type="dxa" w:w="1728"/>
+            <w:tcW w:type="dxa" w:w="1872"/>
           </w:tcPr>
           <w:p>
             <w:pPr>
@@ -5264,7 +5351,7 @@
         </w:tc>
         <w:tc>
           <w:tcPr>
-            <w:tcW w:type="dxa" w:w="1728"/>
+            <w:tcW w:type="dxa" w:w="1872"/>
           </w:tcPr>
           <w:p>
             <w:pPr>
@@ -5280,7 +5367,7 @@
         </w:tc>
         <w:tc>
           <w:tcPr>
-            <w:tcW w:type="dxa" w:w="1728"/>
+            <w:tcW w:type="dxa" w:w="1872"/>
           </w:tcPr>
           <w:p>
             <w:pPr>
@@ -5296,7 +5383,7 @@
         </w:tc>
         <w:tc>
           <w:tcPr>
-            <w:tcW w:type="dxa" w:w="1728"/>
+            <w:tcW w:type="dxa" w:w="1872"/>
           </w:tcPr>
           <w:p>
             <w:pPr>
@@ -5312,7 +5399,7 @@
         </w:tc>
         <w:tc>
           <w:tcPr>
-            <w:tcW w:type="dxa" w:w="1728"/>
+            <w:tcW w:type="dxa" w:w="1872"/>
           </w:tcPr>
           <w:p>
             <w:pPr>
@@ -5330,7 +5417,7 @@
       <w:tr>
         <w:tc>
           <w:tcPr>
-            <w:tcW w:type="dxa" w:w="1728"/>
+            <w:tcW w:type="dxa" w:w="1872"/>
           </w:tcPr>
           <w:p>
             <w:pPr>
@@ -5346,7 +5433,7 @@
         </w:tc>
         <w:tc>
           <w:tcPr>
-            <w:tcW w:type="dxa" w:w="1728"/>
+            <w:tcW w:type="dxa" w:w="1872"/>
           </w:tcPr>
           <w:p>
             <w:pPr>
@@ -5362,7 +5449,7 @@
         </w:tc>
         <w:tc>
           <w:tcPr>
-            <w:tcW w:type="dxa" w:w="1728"/>
+            <w:tcW w:type="dxa" w:w="1872"/>
           </w:tcPr>
           <w:p>
             <w:pPr>
@@ -5378,7 +5465,7 @@
         </w:tc>
         <w:tc>
           <w:tcPr>
-            <w:tcW w:type="dxa" w:w="1728"/>
+            <w:tcW w:type="dxa" w:w="1872"/>
           </w:tcPr>
           <w:p>
             <w:pPr>
@@ -5394,7 +5481,7 @@
         </w:tc>
         <w:tc>
           <w:tcPr>
-            <w:tcW w:type="dxa" w:w="1728"/>
+            <w:tcW w:type="dxa" w:w="1872"/>
           </w:tcPr>
           <w:p>
             <w:pPr>
@@ -5412,7 +5499,7 @@
       <w:tr>
         <w:tc>
           <w:tcPr>
-            <w:tcW w:type="dxa" w:w="1728"/>
+            <w:tcW w:type="dxa" w:w="1872"/>
           </w:tcPr>
           <w:p>
             <w:pPr>
@@ -5428,7 +5515,7 @@
         </w:tc>
         <w:tc>
           <w:tcPr>
-            <w:tcW w:type="dxa" w:w="1728"/>
+            <w:tcW w:type="dxa" w:w="1872"/>
           </w:tcPr>
           <w:p>
             <w:pPr>
@@ -5444,7 +5531,7 @@
         </w:tc>
         <w:tc>
           <w:tcPr>
-            <w:tcW w:type="dxa" w:w="1728"/>
+            <w:tcW w:type="dxa" w:w="1872"/>
           </w:tcPr>
           <w:p>
             <w:pPr>
@@ -5460,7 +5547,7 @@
         </w:tc>
         <w:tc>
           <w:tcPr>
-            <w:tcW w:type="dxa" w:w="1728"/>
+            <w:tcW w:type="dxa" w:w="1872"/>
           </w:tcPr>
           <w:p>
             <w:pPr>
@@ -5476,7 +5563,7 @@
         </w:tc>
         <w:tc>
           <w:tcPr>
-            <w:tcW w:type="dxa" w:w="1728"/>
+            <w:tcW w:type="dxa" w:w="1872"/>
           </w:tcPr>
           <w:p>
             <w:pPr>
@@ -5508,12 +5595,23 @@
     </w:p>
     <w:p>
       <w:pPr>
+        <w:sectPr>
+          <w:type w:val="nextPage"/>
+          <w:pgSz w:w="12240" w:h="15840"/>
+          <w:pgMar w:top="1440" w:right="1440" w:bottom="1440" w:left="1440" w:header="720" w:footer="720" w:gutter="0"/>
+          <w:cols w:space="720"/>
+          <w:docGrid w:linePitch="360"/>
+        </w:sectPr>
+      </w:pPr>
+    </w:p>
+    <w:p>
+      <w:pPr>
         <w:jc w:val="center"/>
       </w:pPr>
       <w:r>
         <w:drawing>
           <wp:inline xmlns:a="http://schemas.openxmlformats.org/drawingml/2006/main" xmlns:pic="http://schemas.openxmlformats.org/drawingml/2006/picture">
-            <wp:extent cx="5943600" cy="2228850"/>
+            <wp:extent cx="9144000" cy="3429000"/>
             <wp:docPr id="25" name="Picture 25"/>
             <wp:cNvGraphicFramePr>
               <a:graphicFrameLocks noChangeAspect="1"/>
@@ -5534,7 +5632,7 @@
                   <pic:spPr>
                     <a:xfrm>
                       <a:off x="0" y="0"/>
-                      <a:ext cx="5943600" cy="2228850"/>
+                      <a:ext cx="9144000" cy="3429000"/>
                     </a:xfrm>
                     <a:prstGeom prst="rect"/>
                   </pic:spPr>
@@ -5560,6 +5658,17 @@
     <w:p/>
     <w:p>
       <w:pPr>
+        <w:sectPr>
+          <w:type w:val="nextPage"/>
+          <w:pgSz w:w="15840" w:h="12240" w:orient="landscape"/>
+          <w:pgMar w:top="1440" w:right="720" w:bottom="1440" w:left="720" w:header="720" w:footer="720" w:gutter="0"/>
+          <w:cols w:space="720"/>
+          <w:docGrid w:linePitch="360"/>
+        </w:sectPr>
+      </w:pPr>
+    </w:p>
+    <w:p>
+      <w:pPr>
         <w:pStyle w:val="Heading3"/>
       </w:pPr>
       <w:r>
@@ -5573,12 +5682,23 @@
     </w:p>
     <w:p>
       <w:pPr>
+        <w:sectPr>
+          <w:type w:val="nextPage"/>
+          <w:pgSz w:w="12240" w:h="15840"/>
+          <w:pgMar w:top="1440" w:right="1440" w:bottom="1440" w:left="1440" w:header="720" w:footer="720" w:gutter="0"/>
+          <w:cols w:space="720"/>
+          <w:docGrid w:linePitch="360"/>
+        </w:sectPr>
+      </w:pPr>
+    </w:p>
+    <w:p>
+      <w:pPr>
         <w:jc w:val="center"/>
       </w:pPr>
       <w:r>
         <w:drawing>
           <wp:inline xmlns:a="http://schemas.openxmlformats.org/drawingml/2006/main" xmlns:pic="http://schemas.openxmlformats.org/drawingml/2006/picture">
-            <wp:extent cx="5943600" cy="2547257"/>
+            <wp:extent cx="9144000" cy="3918857"/>
             <wp:docPr id="26" name="Picture 26"/>
             <wp:cNvGraphicFramePr>
               <a:graphicFrameLocks noChangeAspect="1"/>
@@ -5599,7 +5719,7 @@
                   <pic:spPr>
                     <a:xfrm>
                       <a:off x="0" y="0"/>
-                      <a:ext cx="5943600" cy="2547257"/>
+                      <a:ext cx="9144000" cy="3918857"/>
                     </a:xfrm>
                     <a:prstGeom prst="rect"/>
                   </pic:spPr>
@@ -5625,6 +5745,17 @@
     <w:p/>
     <w:p>
       <w:pPr>
+        <w:sectPr>
+          <w:type w:val="nextPage"/>
+          <w:pgSz w:w="15840" w:h="12240" w:orient="landscape"/>
+          <w:pgMar w:top="1440" w:right="720" w:bottom="1440" w:left="720" w:header="720" w:footer="720" w:gutter="0"/>
+          <w:cols w:space="720"/>
+          <w:docGrid w:linePitch="360"/>
+        </w:sectPr>
+      </w:pPr>
+    </w:p>
+    <w:p>
+      <w:pPr>
         <w:jc w:val="center"/>
       </w:pPr>
       <w:r>
@@ -5643,16 +5774,16 @@
         <w:tblLook w:firstColumn="1" w:firstRow="1" w:lastColumn="0" w:lastRow="0" w:noHBand="0" w:noVBand="1" w:val="04A0"/>
       </w:tblPr>
       <w:tblGrid>
-        <w:gridCol w:w="1728"/>
-        <w:gridCol w:w="1728"/>
-        <w:gridCol w:w="1728"/>
-        <w:gridCol w:w="1728"/>
-        <w:gridCol w:w="1728"/>
+        <w:gridCol w:w="1872"/>
+        <w:gridCol w:w="1872"/>
+        <w:gridCol w:w="1872"/>
+        <w:gridCol w:w="1872"/>
+        <w:gridCol w:w="1872"/>
       </w:tblGrid>
       <w:tr>
         <w:tc>
           <w:tcPr>
-            <w:tcW w:type="dxa" w:w="1728"/>
+            <w:tcW w:type="dxa" w:w="1872"/>
           </w:tcPr>
           <w:p>
             <w:pPr>
@@ -5669,7 +5800,7 @@
         </w:tc>
         <w:tc>
           <w:tcPr>
-            <w:tcW w:type="dxa" w:w="1728"/>
+            <w:tcW w:type="dxa" w:w="1872"/>
           </w:tcPr>
           <w:p>
             <w:pPr>
@@ -5686,7 +5817,7 @@
         </w:tc>
         <w:tc>
           <w:tcPr>
-            <w:tcW w:type="dxa" w:w="1728"/>
+            <w:tcW w:type="dxa" w:w="1872"/>
           </w:tcPr>
           <w:p>
             <w:pPr>
@@ -5703,7 +5834,7 @@
         </w:tc>
         <w:tc>
           <w:tcPr>
-            <w:tcW w:type="dxa" w:w="1728"/>
+            <w:tcW w:type="dxa" w:w="1872"/>
           </w:tcPr>
           <w:p>
             <w:pPr>
@@ -5720,7 +5851,7 @@
         </w:tc>
         <w:tc>
           <w:tcPr>
-            <w:tcW w:type="dxa" w:w="1728"/>
+            <w:tcW w:type="dxa" w:w="1872"/>
           </w:tcPr>
           <w:p>
             <w:pPr>
@@ -5739,7 +5870,7 @@
       <w:tr>
         <w:tc>
           <w:tcPr>
-            <w:tcW w:type="dxa" w:w="1728"/>
+            <w:tcW w:type="dxa" w:w="1872"/>
           </w:tcPr>
           <w:p>
             <w:pPr>
@@ -5755,7 +5886,7 @@
         </w:tc>
         <w:tc>
           <w:tcPr>
-            <w:tcW w:type="dxa" w:w="1728"/>
+            <w:tcW w:type="dxa" w:w="1872"/>
           </w:tcPr>
           <w:p>
             <w:pPr>
@@ -5771,7 +5902,7 @@
         </w:tc>
         <w:tc>
           <w:tcPr>
-            <w:tcW w:type="dxa" w:w="1728"/>
+            <w:tcW w:type="dxa" w:w="1872"/>
           </w:tcPr>
           <w:p>
             <w:pPr>
@@ -5787,7 +5918,7 @@
         </w:tc>
         <w:tc>
           <w:tcPr>
-            <w:tcW w:type="dxa" w:w="1728"/>
+            <w:tcW w:type="dxa" w:w="1872"/>
           </w:tcPr>
           <w:p>
             <w:pPr>
@@ -5803,7 +5934,7 @@
         </w:tc>
         <w:tc>
           <w:tcPr>
-            <w:tcW w:type="dxa" w:w="1728"/>
+            <w:tcW w:type="dxa" w:w="1872"/>
           </w:tcPr>
           <w:p>
             <w:pPr>
@@ -5821,7 +5952,7 @@
       <w:tr>
         <w:tc>
           <w:tcPr>
-            <w:tcW w:type="dxa" w:w="1728"/>
+            <w:tcW w:type="dxa" w:w="1872"/>
           </w:tcPr>
           <w:p>
             <w:pPr>
@@ -5837,7 +5968,7 @@
         </w:tc>
         <w:tc>
           <w:tcPr>
-            <w:tcW w:type="dxa" w:w="1728"/>
+            <w:tcW w:type="dxa" w:w="1872"/>
           </w:tcPr>
           <w:p>
             <w:pPr>
@@ -5853,7 +5984,7 @@
         </w:tc>
         <w:tc>
           <w:tcPr>
-            <w:tcW w:type="dxa" w:w="1728"/>
+            <w:tcW w:type="dxa" w:w="1872"/>
           </w:tcPr>
           <w:p>
             <w:pPr>
@@ -5869,7 +6000,7 @@
         </w:tc>
         <w:tc>
           <w:tcPr>
-            <w:tcW w:type="dxa" w:w="1728"/>
+            <w:tcW w:type="dxa" w:w="1872"/>
           </w:tcPr>
           <w:p>
             <w:pPr>
@@ -5885,7 +6016,7 @@
         </w:tc>
         <w:tc>
           <w:tcPr>
-            <w:tcW w:type="dxa" w:w="1728"/>
+            <w:tcW w:type="dxa" w:w="1872"/>
           </w:tcPr>
           <w:p>
             <w:pPr>
@@ -5903,7 +6034,7 @@
       <w:tr>
         <w:tc>
           <w:tcPr>
-            <w:tcW w:type="dxa" w:w="1728"/>
+            <w:tcW w:type="dxa" w:w="1872"/>
           </w:tcPr>
           <w:p>
             <w:pPr>
@@ -5919,7 +6050,7 @@
         </w:tc>
         <w:tc>
           <w:tcPr>
-            <w:tcW w:type="dxa" w:w="1728"/>
+            <w:tcW w:type="dxa" w:w="1872"/>
           </w:tcPr>
           <w:p>
             <w:pPr>
@@ -5935,7 +6066,7 @@
         </w:tc>
         <w:tc>
           <w:tcPr>
-            <w:tcW w:type="dxa" w:w="1728"/>
+            <w:tcW w:type="dxa" w:w="1872"/>
           </w:tcPr>
           <w:p>
             <w:pPr>
@@ -5951,7 +6082,7 @@
         </w:tc>
         <w:tc>
           <w:tcPr>
-            <w:tcW w:type="dxa" w:w="1728"/>
+            <w:tcW w:type="dxa" w:w="1872"/>
           </w:tcPr>
           <w:p>
             <w:pPr>
@@ -5967,7 +6098,7 @@
         </w:tc>
         <w:tc>
           <w:tcPr>
-            <w:tcW w:type="dxa" w:w="1728"/>
+            <w:tcW w:type="dxa" w:w="1872"/>
           </w:tcPr>
           <w:p>
             <w:pPr>
@@ -5985,7 +6116,7 @@
       <w:tr>
         <w:tc>
           <w:tcPr>
-            <w:tcW w:type="dxa" w:w="1728"/>
+            <w:tcW w:type="dxa" w:w="1872"/>
           </w:tcPr>
           <w:p>
             <w:pPr>
@@ -6001,7 +6132,7 @@
         </w:tc>
         <w:tc>
           <w:tcPr>
-            <w:tcW w:type="dxa" w:w="1728"/>
+            <w:tcW w:type="dxa" w:w="1872"/>
           </w:tcPr>
           <w:p>
             <w:pPr>
@@ -6017,7 +6148,7 @@
         </w:tc>
         <w:tc>
           <w:tcPr>
-            <w:tcW w:type="dxa" w:w="1728"/>
+            <w:tcW w:type="dxa" w:w="1872"/>
           </w:tcPr>
           <w:p>
             <w:pPr>
@@ -6033,7 +6164,7 @@
         </w:tc>
         <w:tc>
           <w:tcPr>
-            <w:tcW w:type="dxa" w:w="1728"/>
+            <w:tcW w:type="dxa" w:w="1872"/>
           </w:tcPr>
           <w:p>
             <w:pPr>
@@ -6049,7 +6180,7 @@
         </w:tc>
         <w:tc>
           <w:tcPr>
-            <w:tcW w:type="dxa" w:w="1728"/>
+            <w:tcW w:type="dxa" w:w="1872"/>
           </w:tcPr>
           <w:p>
             <w:pPr>
@@ -6067,7 +6198,7 @@
       <w:tr>
         <w:tc>
           <w:tcPr>
-            <w:tcW w:type="dxa" w:w="1728"/>
+            <w:tcW w:type="dxa" w:w="1872"/>
           </w:tcPr>
           <w:p>
             <w:pPr>
@@ -6083,7 +6214,7 @@
         </w:tc>
         <w:tc>
           <w:tcPr>
-            <w:tcW w:type="dxa" w:w="1728"/>
+            <w:tcW w:type="dxa" w:w="1872"/>
           </w:tcPr>
           <w:p>
             <w:pPr>
@@ -6099,7 +6230,7 @@
         </w:tc>
         <w:tc>
           <w:tcPr>
-            <w:tcW w:type="dxa" w:w="1728"/>
+            <w:tcW w:type="dxa" w:w="1872"/>
           </w:tcPr>
           <w:p>
             <w:pPr>
@@ -6115,7 +6246,7 @@
         </w:tc>
         <w:tc>
           <w:tcPr>
-            <w:tcW w:type="dxa" w:w="1728"/>
+            <w:tcW w:type="dxa" w:w="1872"/>
           </w:tcPr>
           <w:p>
             <w:pPr>
@@ -6131,7 +6262,7 @@
         </w:tc>
         <w:tc>
           <w:tcPr>
-            <w:tcW w:type="dxa" w:w="1728"/>
+            <w:tcW w:type="dxa" w:w="1872"/>
           </w:tcPr>
           <w:p>
             <w:pPr>
@@ -6149,7 +6280,7 @@
       <w:tr>
         <w:tc>
           <w:tcPr>
-            <w:tcW w:type="dxa" w:w="1728"/>
+            <w:tcW w:type="dxa" w:w="1872"/>
           </w:tcPr>
           <w:p>
             <w:pPr>
@@ -6165,7 +6296,7 @@
         </w:tc>
         <w:tc>
           <w:tcPr>
-            <w:tcW w:type="dxa" w:w="1728"/>
+            <w:tcW w:type="dxa" w:w="1872"/>
           </w:tcPr>
           <w:p>
             <w:pPr>
@@ -6181,7 +6312,7 @@
         </w:tc>
         <w:tc>
           <w:tcPr>
-            <w:tcW w:type="dxa" w:w="1728"/>
+            <w:tcW w:type="dxa" w:w="1872"/>
           </w:tcPr>
           <w:p>
             <w:pPr>
@@ -6197,7 +6328,7 @@
         </w:tc>
         <w:tc>
           <w:tcPr>
-            <w:tcW w:type="dxa" w:w="1728"/>
+            <w:tcW w:type="dxa" w:w="1872"/>
           </w:tcPr>
           <w:p>
             <w:pPr>
@@ -6213,7 +6344,7 @@
         </w:tc>
         <w:tc>
           <w:tcPr>
-            <w:tcW w:type="dxa" w:w="1728"/>
+            <w:tcW w:type="dxa" w:w="1872"/>
           </w:tcPr>
           <w:p>
             <w:pPr>
@@ -6231,7 +6362,7 @@
       <w:tr>
         <w:tc>
           <w:tcPr>
-            <w:tcW w:type="dxa" w:w="1728"/>
+            <w:tcW w:type="dxa" w:w="1872"/>
           </w:tcPr>
           <w:p>
             <w:pPr>
@@ -6247,7 +6378,7 @@
         </w:tc>
         <w:tc>
           <w:tcPr>
-            <w:tcW w:type="dxa" w:w="1728"/>
+            <w:tcW w:type="dxa" w:w="1872"/>
           </w:tcPr>
           <w:p>
             <w:pPr>
@@ -6263,7 +6394,7 @@
         </w:tc>
         <w:tc>
           <w:tcPr>
-            <w:tcW w:type="dxa" w:w="1728"/>
+            <w:tcW w:type="dxa" w:w="1872"/>
           </w:tcPr>
           <w:p>
             <w:pPr>
@@ -6279,7 +6410,7 @@
         </w:tc>
         <w:tc>
           <w:tcPr>
-            <w:tcW w:type="dxa" w:w="1728"/>
+            <w:tcW w:type="dxa" w:w="1872"/>
           </w:tcPr>
           <w:p>
             <w:pPr>
@@ -6295,7 +6426,7 @@
         </w:tc>
         <w:tc>
           <w:tcPr>
-            <w:tcW w:type="dxa" w:w="1728"/>
+            <w:tcW w:type="dxa" w:w="1872"/>
           </w:tcPr>
           <w:p>
             <w:pPr>
@@ -6313,7 +6444,7 @@
       <w:tr>
         <w:tc>
           <w:tcPr>
-            <w:tcW w:type="dxa" w:w="1728"/>
+            <w:tcW w:type="dxa" w:w="1872"/>
           </w:tcPr>
           <w:p>
             <w:pPr>
@@ -6329,7 +6460,7 @@
         </w:tc>
         <w:tc>
           <w:tcPr>
-            <w:tcW w:type="dxa" w:w="1728"/>
+            <w:tcW w:type="dxa" w:w="1872"/>
           </w:tcPr>
           <w:p>
             <w:pPr>
@@ -6345,7 +6476,7 @@
         </w:tc>
         <w:tc>
           <w:tcPr>
-            <w:tcW w:type="dxa" w:w="1728"/>
+            <w:tcW w:type="dxa" w:w="1872"/>
           </w:tcPr>
           <w:p>
             <w:pPr>
@@ -6361,7 +6492,7 @@
         </w:tc>
         <w:tc>
           <w:tcPr>
-            <w:tcW w:type="dxa" w:w="1728"/>
+            <w:tcW w:type="dxa" w:w="1872"/>
           </w:tcPr>
           <w:p>
             <w:pPr>
@@ -6377,7 +6508,7 @@
         </w:tc>
         <w:tc>
           <w:tcPr>
-            <w:tcW w:type="dxa" w:w="1728"/>
+            <w:tcW w:type="dxa" w:w="1872"/>
           </w:tcPr>
           <w:p>
             <w:pPr>
@@ -6395,7 +6526,7 @@
       <w:tr>
         <w:tc>
           <w:tcPr>
-            <w:tcW w:type="dxa" w:w="1728"/>
+            <w:tcW w:type="dxa" w:w="1872"/>
           </w:tcPr>
           <w:p>
             <w:pPr>
@@ -6411,7 +6542,7 @@
         </w:tc>
         <w:tc>
           <w:tcPr>
-            <w:tcW w:type="dxa" w:w="1728"/>
+            <w:tcW w:type="dxa" w:w="1872"/>
           </w:tcPr>
           <w:p>
             <w:pPr>
@@ -6427,7 +6558,7 @@
         </w:tc>
         <w:tc>
           <w:tcPr>
-            <w:tcW w:type="dxa" w:w="1728"/>
+            <w:tcW w:type="dxa" w:w="1872"/>
           </w:tcPr>
           <w:p>
             <w:pPr>
@@ -6443,7 +6574,7 @@
         </w:tc>
         <w:tc>
           <w:tcPr>
-            <w:tcW w:type="dxa" w:w="1728"/>
+            <w:tcW w:type="dxa" w:w="1872"/>
           </w:tcPr>
           <w:p>
             <w:pPr>
@@ -6459,7 +6590,7 @@
         </w:tc>
         <w:tc>
           <w:tcPr>
-            <w:tcW w:type="dxa" w:w="1728"/>
+            <w:tcW w:type="dxa" w:w="1872"/>
           </w:tcPr>
           <w:p>
             <w:pPr>
@@ -6477,7 +6608,7 @@
       <w:tr>
         <w:tc>
           <w:tcPr>
-            <w:tcW w:type="dxa" w:w="1728"/>
+            <w:tcW w:type="dxa" w:w="1872"/>
           </w:tcPr>
           <w:p>
             <w:pPr>
@@ -6493,7 +6624,7 @@
         </w:tc>
         <w:tc>
           <w:tcPr>
-            <w:tcW w:type="dxa" w:w="1728"/>
+            <w:tcW w:type="dxa" w:w="1872"/>
           </w:tcPr>
           <w:p>
             <w:pPr>
@@ -6509,7 +6640,7 @@
         </w:tc>
         <w:tc>
           <w:tcPr>
-            <w:tcW w:type="dxa" w:w="1728"/>
+            <w:tcW w:type="dxa" w:w="1872"/>
           </w:tcPr>
           <w:p>
             <w:pPr>
@@ -6525,7 +6656,7 @@
         </w:tc>
         <w:tc>
           <w:tcPr>
-            <w:tcW w:type="dxa" w:w="1728"/>
+            <w:tcW w:type="dxa" w:w="1872"/>
           </w:tcPr>
           <w:p>
             <w:pPr>
@@ -6541,7 +6672,7 @@
         </w:tc>
         <w:tc>
           <w:tcPr>
-            <w:tcW w:type="dxa" w:w="1728"/>
+            <w:tcW w:type="dxa" w:w="1872"/>
           </w:tcPr>
           <w:p>
             <w:pPr>
@@ -6559,7 +6690,7 @@
       <w:tr>
         <w:tc>
           <w:tcPr>
-            <w:tcW w:type="dxa" w:w="1728"/>
+            <w:tcW w:type="dxa" w:w="1872"/>
           </w:tcPr>
           <w:p>
             <w:pPr>
@@ -6575,7 +6706,7 @@
         </w:tc>
         <w:tc>
           <w:tcPr>
-            <w:tcW w:type="dxa" w:w="1728"/>
+            <w:tcW w:type="dxa" w:w="1872"/>
           </w:tcPr>
           <w:p>
             <w:pPr>
@@ -6591,7 +6722,7 @@
         </w:tc>
         <w:tc>
           <w:tcPr>
-            <w:tcW w:type="dxa" w:w="1728"/>
+            <w:tcW w:type="dxa" w:w="1872"/>
           </w:tcPr>
           <w:p>
             <w:pPr>
@@ -6607,7 +6738,7 @@
         </w:tc>
         <w:tc>
           <w:tcPr>
-            <w:tcW w:type="dxa" w:w="1728"/>
+            <w:tcW w:type="dxa" w:w="1872"/>
           </w:tcPr>
           <w:p>
             <w:pPr>
@@ -6623,7 +6754,7 @@
         </w:tc>
         <w:tc>
           <w:tcPr>
-            <w:tcW w:type="dxa" w:w="1728"/>
+            <w:tcW w:type="dxa" w:w="1872"/>
           </w:tcPr>
           <w:p>
             <w:pPr>
@@ -6641,7 +6772,7 @@
       <w:tr>
         <w:tc>
           <w:tcPr>
-            <w:tcW w:type="dxa" w:w="1728"/>
+            <w:tcW w:type="dxa" w:w="1872"/>
           </w:tcPr>
           <w:p>
             <w:pPr>
@@ -6657,7 +6788,7 @@
         </w:tc>
         <w:tc>
           <w:tcPr>
-            <w:tcW w:type="dxa" w:w="1728"/>
+            <w:tcW w:type="dxa" w:w="1872"/>
           </w:tcPr>
           <w:p>
             <w:pPr>
@@ -6673,7 +6804,7 @@
         </w:tc>
         <w:tc>
           <w:tcPr>
-            <w:tcW w:type="dxa" w:w="1728"/>
+            <w:tcW w:type="dxa" w:w="1872"/>
           </w:tcPr>
           <w:p>
             <w:pPr>
@@ -6689,7 +6820,7 @@
         </w:tc>
         <w:tc>
           <w:tcPr>
-            <w:tcW w:type="dxa" w:w="1728"/>
+            <w:tcW w:type="dxa" w:w="1872"/>
           </w:tcPr>
           <w:p>
             <w:pPr>
@@ -6705,7 +6836,7 @@
         </w:tc>
         <w:tc>
           <w:tcPr>
-            <w:tcW w:type="dxa" w:w="1728"/>
+            <w:tcW w:type="dxa" w:w="1872"/>
           </w:tcPr>
           <w:p>
             <w:pPr>
@@ -6723,8 +6854,9 @@
     </w:tbl>
     <w:p/>
     <w:sectPr>
+      <w:type w:val="nextPage"/>
       <w:pgSz w:w="12240" w:h="15840"/>
-      <w:pgMar w:top="1440" w:right="1800" w:bottom="1440" w:left="1800" w:header="720" w:footer="720" w:gutter="0"/>
+      <w:pgMar w:top="1440" w:right="1440" w:bottom="1440" w:left="1440" w:header="720" w:footer="720" w:gutter="0"/>
       <w:cols w:space="720"/>
       <w:docGrid w:linePitch="360"/>
     </w:sectPr>

</xml_diff>

<commit_message>
Fix blurry/unreadable topX and CDR3 figures
Increase base font size from 14 to 20, axis titles to 20pt bold, strip
text to 14-20pt bold, legend text to 14-16pt. Remove x-axis subject ID
labels. Reduce canvas dimensions so text stays proportionally large.
Increase DPI from 200 to 400 for sharp rendering. Regenerate docx.

Co-Authored-By: Claude Opus 4.6 <noreply@anthropic.com>
Claude-Session: https://claude.ai/code/session_01D55fsgxxDUfDTuPfRhF34U
</commit_message>
<xml_diff>
--- a/immunedb_STATS_API/clonal/Clonal_Analysis_Results.docx
+++ b/immunedb_STATS_API/clonal/Clonal_Analysis_Results.docx
@@ -2932,7 +2932,7 @@
       <w:r>
         <w:drawing>
           <wp:inline xmlns:a="http://schemas.openxmlformats.org/drawingml/2006/main" xmlns:pic="http://schemas.openxmlformats.org/drawingml/2006/picture">
-            <wp:extent cx="9144000" cy="3556000"/>
+            <wp:extent cx="9144000" cy="3918857"/>
             <wp:docPr id="21" name="Picture 21"/>
             <wp:cNvGraphicFramePr>
               <a:graphicFrameLocks noChangeAspect="1"/>
@@ -2953,7 +2953,7 @@
                   <pic:spPr>
                     <a:xfrm>
                       <a:off x="0" y="0"/>
-                      <a:ext cx="9144000" cy="3556000"/>
+                      <a:ext cx="9144000" cy="3918857"/>
                     </a:xfrm>
                     <a:prstGeom prst="rect"/>
                   </pic:spPr>
@@ -3626,7 +3626,7 @@
       <w:r>
         <w:drawing>
           <wp:inline xmlns:a="http://schemas.openxmlformats.org/drawingml/2006/main" xmlns:pic="http://schemas.openxmlformats.org/drawingml/2006/picture">
-            <wp:extent cx="9144000" cy="2667000"/>
+            <wp:extent cx="9144000" cy="3048000"/>
             <wp:docPr id="22" name="Picture 22"/>
             <wp:cNvGraphicFramePr>
               <a:graphicFrameLocks noChangeAspect="1"/>
@@ -3647,7 +3647,7 @@
                   <pic:spPr>
                     <a:xfrm>
                       <a:off x="0" y="0"/>
-                      <a:ext cx="9144000" cy="2667000"/>
+                      <a:ext cx="9144000" cy="3048000"/>
                     </a:xfrm>
                     <a:prstGeom prst="rect"/>
                   </pic:spPr>
@@ -3713,7 +3713,7 @@
       <w:r>
         <w:drawing>
           <wp:inline xmlns:a="http://schemas.openxmlformats.org/drawingml/2006/main" xmlns:pic="http://schemas.openxmlformats.org/drawingml/2006/picture">
-            <wp:extent cx="9144000" cy="2909455"/>
+            <wp:extent cx="9144000" cy="3429000"/>
             <wp:docPr id="23" name="Picture 23"/>
             <wp:cNvGraphicFramePr>
               <a:graphicFrameLocks noChangeAspect="1"/>
@@ -3734,7 +3734,7 @@
                   <pic:spPr>
                     <a:xfrm>
                       <a:off x="0" y="0"/>
-                      <a:ext cx="9144000" cy="2909455"/>
+                      <a:ext cx="9144000" cy="3429000"/>
                     </a:xfrm>
                     <a:prstGeom prst="rect"/>
                   </pic:spPr>
@@ -4917,7 +4917,7 @@
       <w:r>
         <w:drawing>
           <wp:inline xmlns:a="http://schemas.openxmlformats.org/drawingml/2006/main" xmlns:pic="http://schemas.openxmlformats.org/drawingml/2006/picture">
-            <wp:extent cx="9144000" cy="4987636"/>
+            <wp:extent cx="9144000" cy="6531429"/>
             <wp:docPr id="24" name="Picture 24"/>
             <wp:cNvGraphicFramePr>
               <a:graphicFrameLocks noChangeAspect="1"/>
@@ -4938,7 +4938,7 @@
                   <pic:spPr>
                     <a:xfrm>
                       <a:off x="0" y="0"/>
-                      <a:ext cx="9144000" cy="4987636"/>
+                      <a:ext cx="9144000" cy="6531429"/>
                     </a:xfrm>
                     <a:prstGeom prst="rect"/>
                   </pic:spPr>
@@ -5611,7 +5611,7 @@
       <w:r>
         <w:drawing>
           <wp:inline xmlns:a="http://schemas.openxmlformats.org/drawingml/2006/main" xmlns:pic="http://schemas.openxmlformats.org/drawingml/2006/picture">
-            <wp:extent cx="9144000" cy="3429000"/>
+            <wp:extent cx="9144000" cy="5080000"/>
             <wp:docPr id="25" name="Picture 25"/>
             <wp:cNvGraphicFramePr>
               <a:graphicFrameLocks noChangeAspect="1"/>
@@ -5632,7 +5632,7 @@
                   <pic:spPr>
                     <a:xfrm>
                       <a:off x="0" y="0"/>
-                      <a:ext cx="9144000" cy="3429000"/>
+                      <a:ext cx="9144000" cy="5080000"/>
                     </a:xfrm>
                     <a:prstGeom prst="rect"/>
                   </pic:spPr>
@@ -5698,7 +5698,7 @@
       <w:r>
         <w:drawing>
           <wp:inline xmlns:a="http://schemas.openxmlformats.org/drawingml/2006/main" xmlns:pic="http://schemas.openxmlformats.org/drawingml/2006/picture">
-            <wp:extent cx="9144000" cy="3918857"/>
+            <wp:extent cx="9144000" cy="5715000"/>
             <wp:docPr id="26" name="Picture 26"/>
             <wp:cNvGraphicFramePr>
               <a:graphicFrameLocks noChangeAspect="1"/>
@@ -5719,7 +5719,7 @@
                   <pic:spPr>
                     <a:xfrm>
                       <a:off x="0" y="0"/>
-                      <a:ext cx="9144000" cy="3918857"/>
+                      <a:ext cx="9144000" cy="5715000"/>
                     </a:xfrm>
                     <a:prstGeom prst="rect"/>
                   </pic:spPr>

</xml_diff>

<commit_message>
Fix cut-off strip text in topX and CDR3 age/sex figures
Rotate facet strip labels to vertical (angle=90) so disease+age and
disease+sex labels are fully visible. Increase figure height to
accommodate vertical text. Regenerate docx.

Co-Authored-By: Claude Opus 4.6 <noreply@anthropic.com>
Claude-Session: https://claude.ai/code/session_01D55fsgxxDUfDTuPfRhF34U
</commit_message>
<xml_diff>
--- a/immunedb_STATS_API/clonal/Clonal_Analysis_Results.docx
+++ b/immunedb_STATS_API/clonal/Clonal_Analysis_Results.docx
@@ -3626,7 +3626,7 @@
       <w:r>
         <w:drawing>
           <wp:inline xmlns:a="http://schemas.openxmlformats.org/drawingml/2006/main" xmlns:pic="http://schemas.openxmlformats.org/drawingml/2006/picture">
-            <wp:extent cx="9144000" cy="3048000"/>
+            <wp:extent cx="9144000" cy="4064000"/>
             <wp:docPr id="22" name="Picture 22"/>
             <wp:cNvGraphicFramePr>
               <a:graphicFrameLocks noChangeAspect="1"/>
@@ -3647,7 +3647,7 @@
                   <pic:spPr>
                     <a:xfrm>
                       <a:off x="0" y="0"/>
-                      <a:ext cx="9144000" cy="3048000"/>
+                      <a:ext cx="9144000" cy="4064000"/>
                     </a:xfrm>
                     <a:prstGeom prst="rect"/>
                   </pic:spPr>
@@ -3713,7 +3713,7 @@
       <w:r>
         <w:drawing>
           <wp:inline xmlns:a="http://schemas.openxmlformats.org/drawingml/2006/main" xmlns:pic="http://schemas.openxmlformats.org/drawingml/2006/picture">
-            <wp:extent cx="9144000" cy="3429000"/>
+            <wp:extent cx="9144000" cy="4572000"/>
             <wp:docPr id="23" name="Picture 23"/>
             <wp:cNvGraphicFramePr>
               <a:graphicFrameLocks noChangeAspect="1"/>
@@ -3734,7 +3734,7 @@
                   <pic:spPr>
                     <a:xfrm>
                       <a:off x="0" y="0"/>
-                      <a:ext cx="9144000" cy="3429000"/>
+                      <a:ext cx="9144000" cy="4572000"/>
                     </a:xfrm>
                     <a:prstGeom prst="rect"/>
                   </pic:spPr>
@@ -5611,7 +5611,7 @@
       <w:r>
         <w:drawing>
           <wp:inline xmlns:a="http://schemas.openxmlformats.org/drawingml/2006/main" xmlns:pic="http://schemas.openxmlformats.org/drawingml/2006/picture">
-            <wp:extent cx="9144000" cy="5080000"/>
+            <wp:extent cx="9144000" cy="6096000"/>
             <wp:docPr id="25" name="Picture 25"/>
             <wp:cNvGraphicFramePr>
               <a:graphicFrameLocks noChangeAspect="1"/>
@@ -5632,7 +5632,7 @@
                   <pic:spPr>
                     <a:xfrm>
                       <a:off x="0" y="0"/>
-                      <a:ext cx="9144000" cy="5080000"/>
+                      <a:ext cx="9144000" cy="6096000"/>
                     </a:xfrm>
                     <a:prstGeom prst="rect"/>
                   </pic:spPr>
@@ -5698,7 +5698,7 @@
       <w:r>
         <w:drawing>
           <wp:inline xmlns:a="http://schemas.openxmlformats.org/drawingml/2006/main" xmlns:pic="http://schemas.openxmlformats.org/drawingml/2006/picture">
-            <wp:extent cx="9144000" cy="5715000"/>
+            <wp:extent cx="9144000" cy="6858000"/>
             <wp:docPr id="26" name="Picture 26"/>
             <wp:cNvGraphicFramePr>
               <a:graphicFrameLocks noChangeAspect="1"/>
@@ -5719,7 +5719,7 @@
                   <pic:spPr>
                     <a:xfrm>
                       <a:off x="0" y="0"/>
-                      <a:ext cx="9144000" cy="5715000"/>
+                      <a:ext cx="9144000" cy="6858000"/>
                     </a:xfrm>
                     <a:prstGeom prst="rect"/>
                   </pic:spPr>

</xml_diff>

<commit_message>
Fix cut-off strip text in Fig 10 (topX) and Fig 12 (CDR3)
Rotate disease category strip labels to vertical on the main
disease-only figures. Increase height for vertical text room.

Co-Authored-By: Claude Opus 4.6 <noreply@anthropic.com>
Claude-Session: https://claude.ai/code/session_01D55fsgxxDUfDTuPfRhF34U
</commit_message>
<xml_diff>
--- a/immunedb_STATS_API/clonal/Clonal_Analysis_Results.docx
+++ b/immunedb_STATS_API/clonal/Clonal_Analysis_Results.docx
@@ -2932,7 +2932,7 @@
       <w:r>
         <w:drawing>
           <wp:inline xmlns:a="http://schemas.openxmlformats.org/drawingml/2006/main" xmlns:pic="http://schemas.openxmlformats.org/drawingml/2006/picture">
-            <wp:extent cx="9144000" cy="3918857"/>
+            <wp:extent cx="9144000" cy="5225143"/>
             <wp:docPr id="21" name="Picture 21"/>
             <wp:cNvGraphicFramePr>
               <a:graphicFrameLocks noChangeAspect="1"/>
@@ -2953,7 +2953,7 @@
                   <pic:spPr>
                     <a:xfrm>
                       <a:off x="0" y="0"/>
-                      <a:ext cx="9144000" cy="3918857"/>
+                      <a:ext cx="9144000" cy="5225143"/>
                     </a:xfrm>
                     <a:prstGeom prst="rect"/>
                   </pic:spPr>
@@ -4917,7 +4917,7 @@
       <w:r>
         <w:drawing>
           <wp:inline xmlns:a="http://schemas.openxmlformats.org/drawingml/2006/main" xmlns:pic="http://schemas.openxmlformats.org/drawingml/2006/picture">
-            <wp:extent cx="9144000" cy="6531429"/>
+            <wp:extent cx="9144000" cy="7837714"/>
             <wp:docPr id="24" name="Picture 24"/>
             <wp:cNvGraphicFramePr>
               <a:graphicFrameLocks noChangeAspect="1"/>
@@ -4938,7 +4938,7 @@
                   <pic:spPr>
                     <a:xfrm>
                       <a:off x="0" y="0"/>
-                      <a:ext cx="9144000" cy="6531429"/>
+                      <a:ext cx="9144000" cy="7837714"/>
                     </a:xfrm>
                     <a:prstGeom prst="rect"/>
                   </pic:spPr>

</xml_diff>

<commit_message>
Fix transparent background and missing legend text in figures
Add bg="white" to all ggsave calls and switch to theme_bw so legend
text, axis titles, and all labels render on a solid white background.

Co-Authored-By: Claude Opus 4.6 <noreply@anthropic.com>
Claude-Session: https://claude.ai/code/session_01D55fsgxxDUfDTuPfRhF34U
</commit_message>
<xml_diff>
--- a/immunedb_STATS_API/clonal/Clonal_Analysis_Results.docx
+++ b/immunedb_STATS_API/clonal/Clonal_Analysis_Results.docx
@@ -4917,7 +4917,7 @@
       <w:r>
         <w:drawing>
           <wp:inline xmlns:a="http://schemas.openxmlformats.org/drawingml/2006/main" xmlns:pic="http://schemas.openxmlformats.org/drawingml/2006/picture">
-            <wp:extent cx="9144000" cy="7837714"/>
+            <wp:extent cx="9144000" cy="5029200"/>
             <wp:docPr id="24" name="Picture 24"/>
             <wp:cNvGraphicFramePr>
               <a:graphicFrameLocks noChangeAspect="1"/>
@@ -4938,7 +4938,7 @@
                   <pic:spPr>
                     <a:xfrm>
                       <a:off x="0" y="0"/>
-                      <a:ext cx="9144000" cy="7837714"/>
+                      <a:ext cx="9144000" cy="5029200"/>
                     </a:xfrm>
                     <a:prstGeom prst="rect"/>
                   </pic:spPr>

</xml_diff>